<commit_message>
Build initial donor page and update questionnaire
</commit_message>
<xml_diff>
--- a/principal-information-template.docx
+++ b/principal-information-template.docx
@@ -4,2575 +4,893 @@
   <w:body>
     <w:p>
       <w:pPr>
+        <w:pStyle w:val="Title"/>
         <w:jc w:val="center"/>
       </w:pPr>
       <w:r>
-        <w:rPr>
-          <w:rFonts w:ascii="Georgia" w:hAnsi="Georgia"/>
-          <w:b/>
-          <w:color w:val="7A1F46"/>
-          <w:sz w:val="42"/>
-        </w:rPr>
-        <w:t>Principal / Trustee Information Questionnaire</w:t>
+        <w:t>Principal / Trustee Information Template</w:t>
+      </w:r>
+    </w:p>
+    <w:p/>
+    <w:p>
+      <w:pPr>
+        <w:spacing w:after="80"/>
+      </w:pPr>
+      <w:r>
+        <w:t>Use this template to collect facts, approvals, style requests, and fundraising details for the Swami Vedanta Desikan Thirumaligai, Srirangam webpage.</w:t>
+      </w:r>
+    </w:p>
+    <w:p/>
+    <w:p>
+      <w:pPr>
+        <w:spacing w:after="80"/>
+      </w:pPr>
+      <w:r>
+        <w:t>Short phrases are fine. Kannada or Tamil notes are also fine. Final website English can be rewritten later without changing the intended meaning.</w:t>
+      </w:r>
+    </w:p>
+    <w:p/>
+    <w:p>
+      <w:pPr>
+        <w:pStyle w:val="Heading1"/>
+      </w:pPr>
+      <w:r>
+        <w:t>Working Public Draft Already Prepared</w:t>
       </w:r>
     </w:p>
     <w:p>
       <w:pPr>
-        <w:jc w:val="center"/>
+        <w:pStyle w:val="ListBullet"/>
+        <w:spacing w:after="60"/>
       </w:pPr>
       <w:r>
-        <w:rPr>
-          <w:rFonts w:ascii="Aptos" w:hAnsi="Aptos"/>
-          <w:b/>
-          <w:color w:val="99491A"/>
-          <w:sz w:val="24"/>
-        </w:rPr>
-        <w:t>Swami Vedanta Desikan Thirumaligai, Srirangam</w:t>
+        <w:t>A first donor-page draft has been prepared separately for review.</w:t>
       </w:r>
     </w:p>
     <w:p>
       <w:pPr>
-        <w:spacing w:after="120"/>
+        <w:pStyle w:val="ListBullet"/>
+        <w:spacing w:after="60"/>
       </w:pPr>
       <w:r>
-        <w:rPr>
-          <w:b/>
-        </w:rPr>
-        <w:t xml:space="preserve">Purpose: </w:t>
-      </w:r>
-      <w:r>
-        <w:t>Use this form to confirm the historical, spiritual, renovation, and donor-related information required for the ParakalaMatham webpage.</w:t>
+        <w:t>The public page currently draws on these already-used source references:</w:t>
       </w:r>
     </w:p>
     <w:p>
       <w:pPr>
-        <w:spacing w:after="120"/>
+        <w:pStyle w:val="ListBullet2"/>
+        <w:spacing w:after="40"/>
       </w:pPr>
       <w:r>
-        <w:rPr>
-          <w:b/>
-        </w:rPr>
-        <w:t xml:space="preserve">Guidance: </w:t>
-      </w:r>
-      <w:r>
-        <w:t>Short phrases are fine. Tamil notes are fine. Final English will be cleaned up later without changing the intended meaning.</w:t>
+        <w:t>Official Parakala Matham page:</w:t>
       </w:r>
     </w:p>
     <w:p>
       <w:pPr>
-        <w:spacing w:after="120"/>
+        <w:spacing w:after="80"/>
       </w:pPr>
       <w:r>
-        <w:rPr>
-          <w:b/>
-        </w:rPr>
-        <w:t xml:space="preserve">Page context: </w:t>
-      </w:r>
-      <w:r>
-        <w:t>This is for a donor-facing custom HTML page on parakalamatham.org using the WordPress template Unboxed Content.</w:t>
+        <w:t xml:space="preserve">    https://www.parakalamatham.org/about-the-mutt/sri-parakala-mutt-branches-and-affiliate-temples/newer-tamilnadu-mutts/</w:t>
       </w:r>
     </w:p>
     <w:p>
       <w:pPr>
-        <w:spacing w:before="240" w:after="120"/>
+        <w:pStyle w:val="ListBullet2"/>
+        <w:spacing w:after="40"/>
       </w:pPr>
       <w:r>
-        <w:rPr>
-          <w:rFonts w:ascii="Georgia" w:hAnsi="Georgia"/>
-          <w:b/>
-          <w:color w:val="7A1F46"/>
-          <w:sz w:val="28"/>
-        </w:rPr>
+        <w:t>Supporting blog reference:</w:t>
+      </w:r>
+    </w:p>
+    <w:p>
+      <w:pPr>
+        <w:spacing w:after="80"/>
+      </w:pPr>
+      <w:r>
+        <w:t xml:space="preserve">    https://aravamudham.blogspot.com/2010/07/swami-desikans-thirumaligai-at-sri.html</w:t>
+      </w:r>
+    </w:p>
+    <w:p>
+      <w:pPr>
+        <w:pStyle w:val="ListBullet"/>
+        <w:spacing w:after="60"/>
+      </w:pPr>
+      <w:r>
+        <w:t>Please use this form to confirm, correct, strengthen, or remove any wording before the page is treated as final.</w:t>
+      </w:r>
+    </w:p>
+    <w:p/>
+    <w:p>
+      <w:pPr>
+        <w:pStyle w:val="Heading1"/>
+      </w:pPr>
+      <w:r>
+        <w:t>Items To Resolve Internally Before Final Public Release</w:t>
+      </w:r>
+    </w:p>
+    <w:p>
+      <w:pPr>
+        <w:pStyle w:val="ListBullet"/>
+        <w:spacing w:after="60"/>
+      </w:pPr>
+      <w:r>
+        <w:t>Should the page publicly say Swami Desikan lived here for about 42 years:</w:t>
+      </w:r>
+    </w:p>
+    <w:p>
+      <w:pPr>
+        <w:pStyle w:val="ListBullet"/>
+        <w:spacing w:after="60"/>
+      </w:pPr>
+      <w:r>
+        <w:t>Should the page publicly say he attained Paramapadam from here:</w:t>
+      </w:r>
+    </w:p>
+    <w:p>
+      <w:pPr>
+        <w:pStyle w:val="ListBullet"/>
+        <w:spacing w:after="60"/>
+      </w:pPr>
+      <w:r>
+        <w:t>Should the page mention preserved features such as the stone structure, wooden girders, family pestle, and kUrmAsanam:</w:t>
+      </w:r>
+    </w:p>
+    <w:p>
+      <w:pPr>
+        <w:pStyle w:val="ListBullet"/>
+        <w:spacing w:after="60"/>
+      </w:pPr>
+      <w:r>
+        <w:t>Should the page publicly use 300+ years old:</w:t>
+      </w:r>
+    </w:p>
+    <w:p>
+      <w:pPr>
+        <w:pStyle w:val="ListBullet"/>
+        <w:spacing w:after="60"/>
+      </w:pPr>
+      <w:r>
+        <w:t>Should the public cost figure be Rs. 25 lakhs or Rs. 27 lakhs:</w:t>
+      </w:r>
+    </w:p>
+    <w:p>
+      <w:pPr>
+        <w:pStyle w:val="ListBullet"/>
+        <w:spacing w:after="60"/>
+      </w:pPr>
+      <w:r>
+        <w:t>Should PLM USA support be shown publicly as Rs. 10 lakhs:</w:t>
+      </w:r>
+    </w:p>
+    <w:p>
+      <w:pPr>
+        <w:pStyle w:val="ListBullet"/>
+        <w:spacing w:after="60"/>
+      </w:pPr>
+      <w:r>
+        <w:t>Are bank details / UPI / QR details approved for immediate publication:</w:t>
+      </w:r>
+    </w:p>
+    <w:p/>
+    <w:p>
+      <w:pPr>
+        <w:pStyle w:val="Heading1"/>
+      </w:pPr>
+      <w:r>
         <w:t>1. Official Identity</w:t>
       </w:r>
     </w:p>
     <w:p>
       <w:pPr>
-        <w:spacing w:after="20"/>
+        <w:pStyle w:val="ListBullet"/>
+        <w:spacing w:after="60"/>
       </w:pPr>
       <w:r>
-        <w:rPr>
-          <w:b/>
-          <w:color w:val="3F2A1E"/>
-        </w:rPr>
-        <w:t xml:space="preserve">Official English name to use on the page: </w:t>
+        <w:t>Official English name to use on the page:</w:t>
       </w:r>
     </w:p>
     <w:p>
       <w:pPr>
-        <w:spacing w:after="40"/>
-        <w:ind w:left="144"/>
+        <w:pStyle w:val="ListBullet"/>
+        <w:spacing w:after="60"/>
       </w:pPr>
       <w:r>
-        <w:rPr>
-          <w:rFonts w:ascii="Aptos" w:hAnsi="Aptos"/>
-          <w:color w:val="6B5A4B"/>
-          <w:sz w:val="21"/>
-        </w:rPr>
-        <w:t>________________________________________________________________________________</w:t>
+        <w:t>Official Tamil / Sanskrit / other name to use on the page:</w:t>
       </w:r>
     </w:p>
     <w:p>
       <w:pPr>
-        <w:spacing w:after="20"/>
+        <w:pStyle w:val="ListBullet"/>
+        <w:spacing w:after="60"/>
       </w:pPr>
       <w:r>
-        <w:rPr>
-          <w:b/>
-          <w:color w:val="3F2A1E"/>
-        </w:rPr>
-        <w:t xml:space="preserve">Official Tamil / Sanskrit / other name to use on the page: </w:t>
+        <w:t>Alternate names by which devotees know this place:</w:t>
       </w:r>
     </w:p>
     <w:p>
       <w:pPr>
-        <w:spacing w:after="40"/>
-        <w:ind w:left="144"/>
+        <w:pStyle w:val="ListBullet"/>
+        <w:spacing w:after="60"/>
       </w:pPr>
       <w:r>
-        <w:rPr>
-          <w:rFonts w:ascii="Aptos" w:hAnsi="Aptos"/>
-          <w:color w:val="6B5A4B"/>
-          <w:sz w:val="21"/>
-        </w:rPr>
-        <w:t>________________________________________________________________________________</w:t>
+        <w:t>Full location / address:</w:t>
       </w:r>
     </w:p>
+    <w:p/>
     <w:p>
       <w:pPr>
-        <w:spacing w:after="20"/>
+        <w:pStyle w:val="Heading1"/>
       </w:pPr>
       <w:r>
-        <w:rPr>
-          <w:b/>
-          <w:color w:val="3F2A1E"/>
-        </w:rPr>
-        <w:t xml:space="preserve">Alternate names by which devotees know this place: </w:t>
-      </w:r>
-    </w:p>
-    <w:p>
-      <w:pPr>
-        <w:spacing w:after="40"/>
-        <w:ind w:left="144"/>
-      </w:pPr>
-      <w:r>
-        <w:rPr>
-          <w:rFonts w:ascii="Aptos" w:hAnsi="Aptos"/>
-          <w:color w:val="6B5A4B"/>
-          <w:sz w:val="21"/>
-        </w:rPr>
-        <w:t>________________________________________________________________________________</w:t>
-      </w:r>
-    </w:p>
-    <w:p>
-      <w:pPr>
-        <w:spacing w:after="20"/>
-      </w:pPr>
-      <w:r>
-        <w:rPr>
-          <w:b/>
-          <w:color w:val="3F2A1E"/>
-        </w:rPr>
-        <w:t xml:space="preserve">Full location / address: </w:t>
-      </w:r>
-    </w:p>
-    <w:p>
-      <w:pPr>
-        <w:spacing w:after="40"/>
-        <w:ind w:left="144"/>
-      </w:pPr>
-      <w:r>
-        <w:rPr>
-          <w:rFonts w:ascii="Aptos" w:hAnsi="Aptos"/>
-          <w:color w:val="6B5A4B"/>
-          <w:sz w:val="21"/>
-        </w:rPr>
-        <w:t>________________________________________________________________________________</w:t>
-      </w:r>
-    </w:p>
-    <w:p>
-      <w:pPr>
-        <w:spacing w:before="240" w:after="120"/>
-      </w:pPr>
-      <w:r>
-        <w:rPr>
-          <w:rFonts w:ascii="Georgia" w:hAnsi="Georgia"/>
-          <w:b/>
-          <w:color w:val="7A1F46"/>
-          <w:sz w:val="28"/>
-        </w:rPr>
         <w:t>2. Historical Importance</w:t>
       </w:r>
     </w:p>
     <w:p>
       <w:pPr>
-        <w:spacing w:after="20"/>
+        <w:pStyle w:val="ListBullet"/>
+        <w:spacing w:after="60"/>
       </w:pPr>
       <w:r>
-        <w:rPr>
-          <w:b/>
-          <w:color w:val="3F2A1E"/>
-        </w:rPr>
-        <w:t xml:space="preserve">How should the site be described in one paragraph: </w:t>
+        <w:t>How should the site be described in one paragraph:</w:t>
       </w:r>
     </w:p>
     <w:p>
       <w:pPr>
-        <w:spacing w:after="40"/>
-        <w:ind w:left="144"/>
+        <w:pStyle w:val="ListBullet"/>
+        <w:spacing w:after="60"/>
       </w:pPr>
       <w:r>
-        <w:rPr>
-          <w:rFonts w:ascii="Aptos" w:hAnsi="Aptos"/>
-          <w:color w:val="6B5A4B"/>
-          <w:sz w:val="21"/>
-        </w:rPr>
-        <w:t>________________________________________________________________________________</w:t>
+        <w:t>Is it correct to say this is Swami Vedanta Desikan's Thirumaligai:</w:t>
       </w:r>
     </w:p>
     <w:p>
       <w:pPr>
-        <w:spacing w:after="40"/>
-        <w:ind w:left="144"/>
+        <w:pStyle w:val="ListBullet"/>
+        <w:spacing w:after="60"/>
       </w:pPr>
       <w:r>
-        <w:rPr>
-          <w:rFonts w:ascii="Aptos" w:hAnsi="Aptos"/>
-          <w:color w:val="6B5A4B"/>
-          <w:sz w:val="21"/>
-        </w:rPr>
-        <w:t>________________________________________________________________________________</w:t>
+        <w:t>Is it correct to say this was a blessed vaasasthanam of Swami Desikan:</w:t>
       </w:r>
     </w:p>
     <w:p>
       <w:pPr>
-        <w:spacing w:after="40"/>
-        <w:ind w:left="144"/>
+        <w:pStyle w:val="ListBullet"/>
+        <w:spacing w:after="60"/>
       </w:pPr>
       <w:r>
-        <w:rPr>
-          <w:rFonts w:ascii="Aptos" w:hAnsi="Aptos"/>
-          <w:color w:val="6B5A4B"/>
-          <w:sz w:val="21"/>
-        </w:rPr>
-        <w:t>________________________________________________________________________________</w:t>
+        <w:t>Is it correct to say Swami Desikan stayed here for about 42 years:</w:t>
       </w:r>
     </w:p>
     <w:p>
       <w:pPr>
-        <w:spacing w:after="20"/>
+        <w:pStyle w:val="ListBullet"/>
+        <w:spacing w:after="60"/>
       </w:pPr>
       <w:r>
-        <w:rPr>
-          <w:b/>
-          <w:color w:val="3F2A1E"/>
-        </w:rPr>
-        <w:t xml:space="preserve">Is it correct to say this is Swami Vedanta Desikan's Thirumaligai: </w:t>
+        <w:t>Is it correct to say he attained Paramapadam from here:</w:t>
       </w:r>
     </w:p>
     <w:p>
       <w:pPr>
-        <w:spacing w:after="40"/>
-        <w:ind w:left="144"/>
+        <w:pStyle w:val="ListBullet"/>
+        <w:spacing w:after="60"/>
       </w:pPr>
       <w:r>
-        <w:rPr>
-          <w:rFonts w:ascii="Aptos" w:hAnsi="Aptos"/>
-          <w:color w:val="6B5A4B"/>
-          <w:sz w:val="21"/>
-        </w:rPr>
-        <w:t>________________________________________________________________________________</w:t>
+        <w:t>If yes, what is the preferred authoritative wording for the Paramapadam statement:</w:t>
       </w:r>
     </w:p>
     <w:p>
       <w:pPr>
-        <w:spacing w:after="20"/>
+        <w:pStyle w:val="ListBullet"/>
+        <w:spacing w:after="60"/>
       </w:pPr>
       <w:r>
-        <w:rPr>
-          <w:b/>
-          <w:color w:val="3F2A1E"/>
-        </w:rPr>
-        <w:t xml:space="preserve">Is it correct to say this was a blessed vaasasthanam of Swami Desikan: </w:t>
+        <w:t>Any wording that should NOT be used publicly:</w:t>
       </w:r>
     </w:p>
+    <w:p/>
     <w:p>
       <w:pPr>
-        <w:spacing w:after="40"/>
-        <w:ind w:left="144"/>
+        <w:pStyle w:val="Heading1"/>
       </w:pPr>
       <w:r>
-        <w:rPr>
-          <w:rFonts w:ascii="Aptos" w:hAnsi="Aptos"/>
-          <w:color w:val="6B5A4B"/>
-          <w:sz w:val="21"/>
-        </w:rPr>
-        <w:t>________________________________________________________________________________</w:t>
-      </w:r>
-    </w:p>
-    <w:p>
-      <w:pPr>
-        <w:spacing w:after="20"/>
-      </w:pPr>
-      <w:r>
-        <w:rPr>
-          <w:b/>
-          <w:color w:val="3F2A1E"/>
-        </w:rPr>
-        <w:t xml:space="preserve">Is it correct to say Swami Desikan stayed here for about 42 years: </w:t>
-      </w:r>
-    </w:p>
-    <w:p>
-      <w:pPr>
-        <w:spacing w:after="40"/>
-        <w:ind w:left="144"/>
-      </w:pPr>
-      <w:r>
-        <w:rPr>
-          <w:rFonts w:ascii="Aptos" w:hAnsi="Aptos"/>
-          <w:color w:val="6B5A4B"/>
-          <w:sz w:val="21"/>
-        </w:rPr>
-        <w:t>________________________________________________________________________________</w:t>
-      </w:r>
-    </w:p>
-    <w:p>
-      <w:pPr>
-        <w:spacing w:after="20"/>
-      </w:pPr>
-      <w:r>
-        <w:rPr>
-          <w:b/>
-          <w:color w:val="3F2A1E"/>
-        </w:rPr>
-        <w:t xml:space="preserve">Is it correct to say he attained Paramapadam from here: </w:t>
-      </w:r>
-    </w:p>
-    <w:p>
-      <w:pPr>
-        <w:spacing w:after="40"/>
-        <w:ind w:left="144"/>
-      </w:pPr>
-      <w:r>
-        <w:rPr>
-          <w:rFonts w:ascii="Aptos" w:hAnsi="Aptos"/>
-          <w:color w:val="6B5A4B"/>
-          <w:sz w:val="21"/>
-        </w:rPr>
-        <w:t>________________________________________________________________________________</w:t>
-      </w:r>
-    </w:p>
-    <w:p>
-      <w:pPr>
-        <w:spacing w:after="20"/>
-      </w:pPr>
-      <w:r>
-        <w:rPr>
-          <w:b/>
-          <w:color w:val="3F2A1E"/>
-        </w:rPr>
-        <w:t xml:space="preserve">Any wording that should NOT be used publicly: </w:t>
-      </w:r>
-    </w:p>
-    <w:p>
-      <w:pPr>
-        <w:spacing w:after="40"/>
-        <w:ind w:left="144"/>
-      </w:pPr>
-      <w:r>
-        <w:rPr>
-          <w:rFonts w:ascii="Aptos" w:hAnsi="Aptos"/>
-          <w:color w:val="6B5A4B"/>
-          <w:sz w:val="21"/>
-        </w:rPr>
-        <w:t>________________________________________________________________________________</w:t>
-      </w:r>
-    </w:p>
-    <w:p>
-      <w:pPr>
-        <w:spacing w:after="40"/>
-        <w:ind w:left="144"/>
-      </w:pPr>
-      <w:r>
-        <w:rPr>
-          <w:rFonts w:ascii="Aptos" w:hAnsi="Aptos"/>
-          <w:color w:val="6B5A4B"/>
-          <w:sz w:val="21"/>
-        </w:rPr>
-        <w:t>________________________________________________________________________________</w:t>
-      </w:r>
-    </w:p>
-    <w:p>
-      <w:pPr>
-        <w:spacing w:after="40"/>
-        <w:ind w:left="144"/>
-      </w:pPr>
-      <w:r>
-        <w:rPr>
-          <w:rFonts w:ascii="Aptos" w:hAnsi="Aptos"/>
-          <w:color w:val="6B5A4B"/>
-          <w:sz w:val="21"/>
-        </w:rPr>
-        <w:t>________________________________________________________________________________</w:t>
-      </w:r>
-    </w:p>
-    <w:p>
-      <w:r>
-        <w:br w:type="page"/>
-      </w:r>
-    </w:p>
-    <w:p>
-      <w:pPr>
-        <w:spacing w:before="240" w:after="120"/>
-      </w:pPr>
-      <w:r>
-        <w:rPr>
-          <w:rFonts w:ascii="Georgia" w:hAnsi="Georgia"/>
-          <w:b/>
-          <w:color w:val="7A1F46"/>
-          <w:sz w:val="28"/>
-        </w:rPr>
         <w:t>3. Importance To Parakala Matham</w:t>
       </w:r>
     </w:p>
     <w:p>
       <w:pPr>
-        <w:spacing w:after="20"/>
+        <w:pStyle w:val="ListBullet"/>
+        <w:spacing w:after="60"/>
       </w:pPr>
       <w:r>
-        <w:rPr>
-          <w:b/>
-          <w:color w:val="3F2A1E"/>
-        </w:rPr>
-        <w:t xml:space="preserve">How is this site connected to Parakala Matham: </w:t>
+        <w:t>How is this site connected to Parakala Matham:</w:t>
       </w:r>
     </w:p>
     <w:p>
       <w:pPr>
-        <w:spacing w:after="40"/>
-        <w:ind w:left="144"/>
+        <w:pStyle w:val="ListBullet"/>
+        <w:spacing w:after="60"/>
       </w:pPr>
       <w:r>
-        <w:rPr>
-          <w:rFonts w:ascii="Aptos" w:hAnsi="Aptos"/>
-          <w:color w:val="6B5A4B"/>
-          <w:sz w:val="21"/>
-        </w:rPr>
-        <w:t>________________________________________________________________________________</w:t>
+        <w:t>How should this connection be described on the website:</w:t>
       </w:r>
     </w:p>
     <w:p>
       <w:pPr>
-        <w:spacing w:after="40"/>
-        <w:ind w:left="144"/>
+        <w:pStyle w:val="ListBullet"/>
+        <w:spacing w:after="60"/>
       </w:pPr>
       <w:r>
-        <w:rPr>
-          <w:rFonts w:ascii="Aptos" w:hAnsi="Aptos"/>
-          <w:color w:val="6B5A4B"/>
-          <w:sz w:val="21"/>
-        </w:rPr>
-        <w:t>________________________________________________________________________________</w:t>
+        <w:t>Any specific Acharya / parampara wording preferred:</w:t>
       </w:r>
     </w:p>
+    <w:p/>
     <w:p>
       <w:pPr>
-        <w:spacing w:after="40"/>
-        <w:ind w:left="144"/>
+        <w:pStyle w:val="Heading1"/>
       </w:pPr>
       <w:r>
-        <w:rPr>
-          <w:rFonts w:ascii="Aptos" w:hAnsi="Aptos"/>
-          <w:color w:val="6B5A4B"/>
-          <w:sz w:val="21"/>
-        </w:rPr>
-        <w:t>________________________________________________________________________________</w:t>
-      </w:r>
-    </w:p>
-    <w:p>
-      <w:pPr>
-        <w:spacing w:after="20"/>
-      </w:pPr>
-      <w:r>
-        <w:rPr>
-          <w:b/>
-          <w:color w:val="3F2A1E"/>
-        </w:rPr>
-        <w:t xml:space="preserve">How should this connection be described on the website: </w:t>
-      </w:r>
-    </w:p>
-    <w:p>
-      <w:pPr>
-        <w:spacing w:after="40"/>
-        <w:ind w:left="144"/>
-      </w:pPr>
-      <w:r>
-        <w:rPr>
-          <w:rFonts w:ascii="Aptos" w:hAnsi="Aptos"/>
-          <w:color w:val="6B5A4B"/>
-          <w:sz w:val="21"/>
-        </w:rPr>
-        <w:t>________________________________________________________________________________</w:t>
-      </w:r>
-    </w:p>
-    <w:p>
-      <w:pPr>
-        <w:spacing w:after="40"/>
-        <w:ind w:left="144"/>
-      </w:pPr>
-      <w:r>
-        <w:rPr>
-          <w:rFonts w:ascii="Aptos" w:hAnsi="Aptos"/>
-          <w:color w:val="6B5A4B"/>
-          <w:sz w:val="21"/>
-        </w:rPr>
-        <w:t>________________________________________________________________________________</w:t>
-      </w:r>
-    </w:p>
-    <w:p>
-      <w:pPr>
-        <w:spacing w:after="40"/>
-        <w:ind w:left="144"/>
-      </w:pPr>
-      <w:r>
-        <w:rPr>
-          <w:rFonts w:ascii="Aptos" w:hAnsi="Aptos"/>
-          <w:color w:val="6B5A4B"/>
-          <w:sz w:val="21"/>
-        </w:rPr>
-        <w:t>________________________________________________________________________________</w:t>
-      </w:r>
-    </w:p>
-    <w:p>
-      <w:pPr>
-        <w:spacing w:after="20"/>
-      </w:pPr>
-      <w:r>
-        <w:rPr>
-          <w:b/>
-          <w:color w:val="3F2A1E"/>
-        </w:rPr>
-        <w:t xml:space="preserve">Any specific Acharya / parampara wording preferred: </w:t>
-      </w:r>
-    </w:p>
-    <w:p>
-      <w:pPr>
-        <w:spacing w:after="40"/>
-        <w:ind w:left="144"/>
-      </w:pPr>
-      <w:r>
-        <w:rPr>
-          <w:rFonts w:ascii="Aptos" w:hAnsi="Aptos"/>
-          <w:color w:val="6B5A4B"/>
-          <w:sz w:val="21"/>
-        </w:rPr>
-        <w:t>________________________________________________________________________________</w:t>
-      </w:r>
-    </w:p>
-    <w:p>
-      <w:pPr>
-        <w:spacing w:after="40"/>
-        <w:ind w:left="144"/>
-      </w:pPr>
-      <w:r>
-        <w:rPr>
-          <w:rFonts w:ascii="Aptos" w:hAnsi="Aptos"/>
-          <w:color w:val="6B5A4B"/>
-          <w:sz w:val="21"/>
-        </w:rPr>
-        <w:t>________________________________________________________________________________</w:t>
-      </w:r>
-    </w:p>
-    <w:p>
-      <w:pPr>
-        <w:spacing w:after="40"/>
-        <w:ind w:left="144"/>
-      </w:pPr>
-      <w:r>
-        <w:rPr>
-          <w:rFonts w:ascii="Aptos" w:hAnsi="Aptos"/>
-          <w:color w:val="6B5A4B"/>
-          <w:sz w:val="21"/>
-        </w:rPr>
-        <w:t>________________________________________________________________________________</w:t>
-      </w:r>
-    </w:p>
-    <w:p>
-      <w:pPr>
-        <w:spacing w:before="240" w:after="120"/>
-      </w:pPr>
-      <w:r>
-        <w:rPr>
-          <w:rFonts w:ascii="Georgia" w:hAnsi="Georgia"/>
-          <w:b/>
-          <w:color w:val="7A1F46"/>
-          <w:sz w:val="28"/>
-        </w:rPr>
         <w:t>4. Current Religious Activity</w:t>
       </w:r>
     </w:p>
     <w:p>
       <w:pPr>
-        <w:spacing w:after="20"/>
+        <w:pStyle w:val="ListBullet"/>
+        <w:spacing w:after="60"/>
       </w:pPr>
       <w:r>
-        <w:rPr>
-          <w:b/>
-          <w:color w:val="3F2A1E"/>
-        </w:rPr>
-        <w:t xml:space="preserve">What regular worship is conducted here: </w:t>
+        <w:t>What regular worship is conducted here:</w:t>
       </w:r>
     </w:p>
     <w:p>
       <w:pPr>
-        <w:spacing w:after="40"/>
-        <w:ind w:left="144"/>
+        <w:pStyle w:val="ListBullet"/>
+        <w:spacing w:after="60"/>
       </w:pPr>
       <w:r>
-        <w:rPr>
-          <w:rFonts w:ascii="Aptos" w:hAnsi="Aptos"/>
-          <w:color w:val="6B5A4B"/>
-          <w:sz w:val="21"/>
-        </w:rPr>
-        <w:t>________________________________________________________________________________</w:t>
+        <w:t>Are Thiruvaradanam and daily kainkaryams performed:</w:t>
       </w:r>
     </w:p>
     <w:p>
       <w:pPr>
-        <w:spacing w:after="40"/>
-        <w:ind w:left="144"/>
+        <w:pStyle w:val="ListBullet"/>
+        <w:spacing w:after="60"/>
       </w:pPr>
       <w:r>
-        <w:rPr>
-          <w:rFonts w:ascii="Aptos" w:hAnsi="Aptos"/>
-          <w:color w:val="6B5A4B"/>
-          <w:sz w:val="21"/>
-        </w:rPr>
-        <w:t>________________________________________________________________________________</w:t>
+        <w:t>What utsavams / Thirunakshatrams are observed here:</w:t>
       </w:r>
     </w:p>
     <w:p>
       <w:pPr>
-        <w:spacing w:after="40"/>
-        <w:ind w:left="144"/>
+        <w:pStyle w:val="ListBullet"/>
+        <w:spacing w:after="60"/>
       </w:pPr>
       <w:r>
-        <w:rPr>
-          <w:rFonts w:ascii="Aptos" w:hAnsi="Aptos"/>
-          <w:color w:val="6B5A4B"/>
-          <w:sz w:val="21"/>
-        </w:rPr>
-        <w:t>________________________________________________________________________________</w:t>
+        <w:t>Are Veda / Prabandha pathams or kalakshepams conducted:</w:t>
       </w:r>
     </w:p>
     <w:p>
       <w:pPr>
-        <w:spacing w:after="20"/>
+        <w:pStyle w:val="ListBullet"/>
+        <w:spacing w:after="60"/>
       </w:pPr>
       <w:r>
-        <w:rPr>
-          <w:b/>
-          <w:color w:val="3F2A1E"/>
-        </w:rPr>
-        <w:t xml:space="preserve">Are Thiruvaradanam and daily kainkaryams performed: </w:t>
+        <w:t>Any other important spiritual activity to mention:</w:t>
       </w:r>
     </w:p>
+    <w:p/>
     <w:p>
       <w:pPr>
-        <w:spacing w:after="40"/>
-        <w:ind w:left="144"/>
+        <w:pStyle w:val="Heading1"/>
       </w:pPr>
       <w:r>
-        <w:rPr>
-          <w:rFonts w:ascii="Aptos" w:hAnsi="Aptos"/>
-          <w:color w:val="6B5A4B"/>
-          <w:sz w:val="21"/>
-        </w:rPr>
-        <w:t>________________________________________________________________________________</w:t>
-      </w:r>
-    </w:p>
-    <w:p>
-      <w:pPr>
-        <w:spacing w:after="20"/>
-      </w:pPr>
-      <w:r>
-        <w:rPr>
-          <w:b/>
-          <w:color w:val="3F2A1E"/>
-        </w:rPr>
-        <w:t xml:space="preserve">What utsavams / Thirunakshatrams are observed here: </w:t>
-      </w:r>
-    </w:p>
-    <w:p>
-      <w:pPr>
-        <w:spacing w:after="40"/>
-        <w:ind w:left="144"/>
-      </w:pPr>
-      <w:r>
-        <w:rPr>
-          <w:rFonts w:ascii="Aptos" w:hAnsi="Aptos"/>
-          <w:color w:val="6B5A4B"/>
-          <w:sz w:val="21"/>
-        </w:rPr>
-        <w:t>________________________________________________________________________________</w:t>
-      </w:r>
-    </w:p>
-    <w:p>
-      <w:pPr>
-        <w:spacing w:after="40"/>
-        <w:ind w:left="144"/>
-      </w:pPr>
-      <w:r>
-        <w:rPr>
-          <w:rFonts w:ascii="Aptos" w:hAnsi="Aptos"/>
-          <w:color w:val="6B5A4B"/>
-          <w:sz w:val="21"/>
-        </w:rPr>
-        <w:t>________________________________________________________________________________</w:t>
-      </w:r>
-    </w:p>
-    <w:p>
-      <w:pPr>
-        <w:spacing w:after="40"/>
-        <w:ind w:left="144"/>
-      </w:pPr>
-      <w:r>
-        <w:rPr>
-          <w:rFonts w:ascii="Aptos" w:hAnsi="Aptos"/>
-          <w:color w:val="6B5A4B"/>
-          <w:sz w:val="21"/>
-        </w:rPr>
-        <w:t>________________________________________________________________________________</w:t>
-      </w:r>
-    </w:p>
-    <w:p>
-      <w:pPr>
-        <w:spacing w:after="20"/>
-      </w:pPr>
-      <w:r>
-        <w:rPr>
-          <w:b/>
-          <w:color w:val="3F2A1E"/>
-        </w:rPr>
-        <w:t xml:space="preserve">Are Veda / Prabandha pathams or kalakshepams conducted: </w:t>
-      </w:r>
-    </w:p>
-    <w:p>
-      <w:pPr>
-        <w:spacing w:after="40"/>
-        <w:ind w:left="144"/>
-      </w:pPr>
-      <w:r>
-        <w:rPr>
-          <w:rFonts w:ascii="Aptos" w:hAnsi="Aptos"/>
-          <w:color w:val="6B5A4B"/>
-          <w:sz w:val="21"/>
-        </w:rPr>
-        <w:t>________________________________________________________________________________</w:t>
-      </w:r>
-    </w:p>
-    <w:p>
-      <w:pPr>
-        <w:spacing w:after="20"/>
-      </w:pPr>
-      <w:r>
-        <w:rPr>
-          <w:b/>
-          <w:color w:val="3F2A1E"/>
-        </w:rPr>
-        <w:t xml:space="preserve">Any other important spiritual activity to mention: </w:t>
-      </w:r>
-    </w:p>
-    <w:p>
-      <w:pPr>
-        <w:spacing w:after="40"/>
-        <w:ind w:left="144"/>
-      </w:pPr>
-      <w:r>
-        <w:rPr>
-          <w:rFonts w:ascii="Aptos" w:hAnsi="Aptos"/>
-          <w:color w:val="6B5A4B"/>
-          <w:sz w:val="21"/>
-        </w:rPr>
-        <w:t>________________________________________________________________________________</w:t>
-      </w:r>
-    </w:p>
-    <w:p>
-      <w:pPr>
-        <w:spacing w:after="40"/>
-        <w:ind w:left="144"/>
-      </w:pPr>
-      <w:r>
-        <w:rPr>
-          <w:rFonts w:ascii="Aptos" w:hAnsi="Aptos"/>
-          <w:color w:val="6B5A4B"/>
-          <w:sz w:val="21"/>
-        </w:rPr>
-        <w:t>________________________________________________________________________________</w:t>
-      </w:r>
-    </w:p>
-    <w:p>
-      <w:pPr>
-        <w:spacing w:after="40"/>
-        <w:ind w:left="144"/>
-      </w:pPr>
-      <w:r>
-        <w:rPr>
-          <w:rFonts w:ascii="Aptos" w:hAnsi="Aptos"/>
-          <w:color w:val="6B5A4B"/>
-          <w:sz w:val="21"/>
-        </w:rPr>
-        <w:t>________________________________________________________________________________</w:t>
-      </w:r>
-    </w:p>
-    <w:p>
-      <w:r>
-        <w:br w:type="page"/>
-      </w:r>
-    </w:p>
-    <w:p>
-      <w:pPr>
-        <w:spacing w:before="240" w:after="120"/>
-      </w:pPr>
-      <w:r>
-        <w:rPr>
-          <w:rFonts w:ascii="Georgia" w:hAnsi="Georgia"/>
-          <w:b/>
-          <w:color w:val="7A1F46"/>
-          <w:sz w:val="28"/>
-        </w:rPr>
         <w:t>5. Renovation And Repair Need</w:t>
       </w:r>
     </w:p>
     <w:p>
       <w:pPr>
-        <w:spacing w:after="20"/>
+        <w:pStyle w:val="ListBullet"/>
+        <w:spacing w:after="60"/>
       </w:pPr>
       <w:r>
-        <w:rPr>
-          <w:b/>
-          <w:color w:val="3F2A1E"/>
-        </w:rPr>
-        <w:t xml:space="preserve">What is the present condition of the structure: </w:t>
+        <w:t>What is the present condition of the structure:</w:t>
       </w:r>
     </w:p>
     <w:p>
       <w:pPr>
-        <w:spacing w:after="40"/>
-        <w:ind w:left="144"/>
+        <w:pStyle w:val="ListBullet"/>
+        <w:spacing w:after="60"/>
       </w:pPr>
       <w:r>
-        <w:rPr>
-          <w:rFonts w:ascii="Aptos" w:hAnsi="Aptos"/>
-          <w:color w:val="6B5A4B"/>
-          <w:sz w:val="21"/>
-        </w:rPr>
-        <w:t>________________________________________________________________________________</w:t>
+        <w:t>Is the 300+ year old wording approved for public use:</w:t>
       </w:r>
     </w:p>
     <w:p>
       <w:pPr>
-        <w:spacing w:after="40"/>
-        <w:ind w:left="144"/>
+        <w:pStyle w:val="ListBullet"/>
+        <w:spacing w:after="60"/>
       </w:pPr>
       <w:r>
-        <w:rPr>
-          <w:rFonts w:ascii="Aptos" w:hAnsi="Aptos"/>
-          <w:color w:val="6B5A4B"/>
-          <w:sz w:val="21"/>
-        </w:rPr>
-        <w:t>________________________________________________________________________________</w:t>
+        <w:t>What exact problems should be mentioned:</w:t>
       </w:r>
     </w:p>
     <w:p>
       <w:pPr>
-        <w:spacing w:after="40"/>
-        <w:ind w:left="144"/>
+        <w:pStyle w:val="ListBullet"/>
+        <w:spacing w:after="60"/>
       </w:pPr>
       <w:r>
-        <w:rPr>
-          <w:rFonts w:ascii="Aptos" w:hAnsi="Aptos"/>
-          <w:color w:val="6B5A4B"/>
-          <w:sz w:val="21"/>
-        </w:rPr>
-        <w:t>________________________________________________________________________________</w:t>
+        <w:t>Water seepage:</w:t>
       </w:r>
     </w:p>
     <w:p>
       <w:pPr>
-        <w:spacing w:after="20"/>
+        <w:pStyle w:val="ListBullet"/>
+        <w:spacing w:after="60"/>
       </w:pPr>
       <w:r>
-        <w:rPr>
-          <w:b/>
-          <w:color w:val="3F2A1E"/>
-        </w:rPr>
-        <w:t xml:space="preserve">Is the 300+ year old wording approved for public use: </w:t>
+        <w:t>Wall / plaster damage:</w:t>
       </w:r>
     </w:p>
     <w:p>
       <w:pPr>
-        <w:spacing w:after="40"/>
-        <w:ind w:left="144"/>
+        <w:pStyle w:val="ListBullet"/>
+        <w:spacing w:after="60"/>
       </w:pPr>
       <w:r>
-        <w:rPr>
-          <w:rFonts w:ascii="Aptos" w:hAnsi="Aptos"/>
-          <w:color w:val="6B5A4B"/>
-          <w:sz w:val="21"/>
-        </w:rPr>
-        <w:t>________________________________________________________________________________</w:t>
+        <w:t>Floor damage:</w:t>
       </w:r>
     </w:p>
     <w:p>
       <w:pPr>
-        <w:spacing w:after="20"/>
+        <w:pStyle w:val="ListBullet"/>
+        <w:spacing w:after="60"/>
       </w:pPr>
       <w:r>
-        <w:rPr>
-          <w:b/>
-          <w:color w:val="3F2A1E"/>
-        </w:rPr>
-        <w:t xml:space="preserve">What exact problems should be mentioned: </w:t>
+        <w:t>Terrace / roof damage:</w:t>
       </w:r>
     </w:p>
     <w:p>
       <w:pPr>
-        <w:spacing w:after="40"/>
-        <w:ind w:left="144"/>
+        <w:pStyle w:val="ListBullet"/>
+        <w:spacing w:after="60"/>
       </w:pPr>
       <w:r>
-        <w:rPr>
-          <w:rFonts w:ascii="Aptos" w:hAnsi="Aptos"/>
-          <w:color w:val="6B5A4B"/>
-          <w:sz w:val="21"/>
-        </w:rPr>
-        <w:t>________________________________________________________________________________</w:t>
+        <w:t>Any structural risk that must be highlighted:</w:t>
       </w:r>
     </w:p>
+    <w:p/>
     <w:p>
       <w:pPr>
-        <w:spacing w:after="40"/>
-        <w:ind w:left="144"/>
+        <w:pStyle w:val="Heading1"/>
       </w:pPr>
       <w:r>
-        <w:rPr>
-          <w:rFonts w:ascii="Aptos" w:hAnsi="Aptos"/>
-          <w:color w:val="6B5A4B"/>
-          <w:sz w:val="21"/>
-        </w:rPr>
-        <w:t>________________________________________________________________________________</w:t>
-      </w:r>
-    </w:p>
-    <w:p>
-      <w:pPr>
-        <w:spacing w:after="40"/>
-        <w:ind w:left="144"/>
-      </w:pPr>
-      <w:r>
-        <w:rPr>
-          <w:rFonts w:ascii="Aptos" w:hAnsi="Aptos"/>
-          <w:color w:val="6B5A4B"/>
-          <w:sz w:val="21"/>
-        </w:rPr>
-        <w:t>________________________________________________________________________________</w:t>
-      </w:r>
-    </w:p>
-    <w:p>
-      <w:pPr>
-        <w:spacing w:after="20"/>
-      </w:pPr>
-      <w:r>
-        <w:rPr>
-          <w:b/>
-          <w:color w:val="3F2A1E"/>
-        </w:rPr>
-        <w:t xml:space="preserve">Water seepage: </w:t>
-      </w:r>
-    </w:p>
-    <w:p>
-      <w:pPr>
-        <w:spacing w:after="40"/>
-        <w:ind w:left="144"/>
-      </w:pPr>
-      <w:r>
-        <w:rPr>
-          <w:rFonts w:ascii="Aptos" w:hAnsi="Aptos"/>
-          <w:color w:val="6B5A4B"/>
-          <w:sz w:val="21"/>
-        </w:rPr>
-        <w:t>________________________________________________________________________________</w:t>
-      </w:r>
-    </w:p>
-    <w:p>
-      <w:pPr>
-        <w:spacing w:after="20"/>
-      </w:pPr>
-      <w:r>
-        <w:rPr>
-          <w:b/>
-          <w:color w:val="3F2A1E"/>
-        </w:rPr>
-        <w:t xml:space="preserve">Wall / plaster damage: </w:t>
-      </w:r>
-    </w:p>
-    <w:p>
-      <w:pPr>
-        <w:spacing w:after="40"/>
-        <w:ind w:left="144"/>
-      </w:pPr>
-      <w:r>
-        <w:rPr>
-          <w:rFonts w:ascii="Aptos" w:hAnsi="Aptos"/>
-          <w:color w:val="6B5A4B"/>
-          <w:sz w:val="21"/>
-        </w:rPr>
-        <w:t>________________________________________________________________________________</w:t>
-      </w:r>
-    </w:p>
-    <w:p>
-      <w:pPr>
-        <w:spacing w:after="20"/>
-      </w:pPr>
-      <w:r>
-        <w:rPr>
-          <w:b/>
-          <w:color w:val="3F2A1E"/>
-        </w:rPr>
-        <w:t xml:space="preserve">Floor damage: </w:t>
-      </w:r>
-    </w:p>
-    <w:p>
-      <w:pPr>
-        <w:spacing w:after="40"/>
-        <w:ind w:left="144"/>
-      </w:pPr>
-      <w:r>
-        <w:rPr>
-          <w:rFonts w:ascii="Aptos" w:hAnsi="Aptos"/>
-          <w:color w:val="6B5A4B"/>
-          <w:sz w:val="21"/>
-        </w:rPr>
-        <w:t>________________________________________________________________________________</w:t>
-      </w:r>
-    </w:p>
-    <w:p>
-      <w:pPr>
-        <w:spacing w:after="20"/>
-      </w:pPr>
-      <w:r>
-        <w:rPr>
-          <w:b/>
-          <w:color w:val="3F2A1E"/>
-        </w:rPr>
-        <w:t xml:space="preserve">Terrace / roof damage: </w:t>
-      </w:r>
-    </w:p>
-    <w:p>
-      <w:pPr>
-        <w:spacing w:after="40"/>
-        <w:ind w:left="144"/>
-      </w:pPr>
-      <w:r>
-        <w:rPr>
-          <w:rFonts w:ascii="Aptos" w:hAnsi="Aptos"/>
-          <w:color w:val="6B5A4B"/>
-          <w:sz w:val="21"/>
-        </w:rPr>
-        <w:t>________________________________________________________________________________</w:t>
-      </w:r>
-    </w:p>
-    <w:p>
-      <w:pPr>
-        <w:spacing w:after="20"/>
-      </w:pPr>
-      <w:r>
-        <w:rPr>
-          <w:b/>
-          <w:color w:val="3F2A1E"/>
-        </w:rPr>
-        <w:t xml:space="preserve">Any structural risk that must be highlighted: </w:t>
-      </w:r>
-    </w:p>
-    <w:p>
-      <w:pPr>
-        <w:spacing w:after="40"/>
-        <w:ind w:left="144"/>
-      </w:pPr>
-      <w:r>
-        <w:rPr>
-          <w:rFonts w:ascii="Aptos" w:hAnsi="Aptos"/>
-          <w:color w:val="6B5A4B"/>
-          <w:sz w:val="21"/>
-        </w:rPr>
-        <w:t>________________________________________________________________________________</w:t>
-      </w:r>
-    </w:p>
-    <w:p>
-      <w:pPr>
-        <w:spacing w:after="40"/>
-        <w:ind w:left="144"/>
-      </w:pPr>
-      <w:r>
-        <w:rPr>
-          <w:rFonts w:ascii="Aptos" w:hAnsi="Aptos"/>
-          <w:color w:val="6B5A4B"/>
-          <w:sz w:val="21"/>
-        </w:rPr>
-        <w:t>________________________________________________________________________________</w:t>
-      </w:r>
-    </w:p>
-    <w:p>
-      <w:pPr>
-        <w:spacing w:after="40"/>
-        <w:ind w:left="144"/>
-      </w:pPr>
-      <w:r>
-        <w:rPr>
-          <w:rFonts w:ascii="Aptos" w:hAnsi="Aptos"/>
-          <w:color w:val="6B5A4B"/>
-          <w:sz w:val="21"/>
-        </w:rPr>
-        <w:t>________________________________________________________________________________</w:t>
-      </w:r>
-    </w:p>
-    <w:p>
-      <w:pPr>
-        <w:spacing w:before="240" w:after="120"/>
-      </w:pPr>
-      <w:r>
-        <w:rPr>
-          <w:rFonts w:ascii="Georgia" w:hAnsi="Georgia"/>
-          <w:b/>
-          <w:color w:val="7A1F46"/>
-          <w:sz w:val="28"/>
-        </w:rPr>
         <w:t>6. Current Project Scope</w:t>
       </w:r>
     </w:p>
     <w:p>
       <w:pPr>
-        <w:spacing w:after="20"/>
+        <w:pStyle w:val="ListBullet"/>
+        <w:spacing w:after="60"/>
       </w:pPr>
       <w:r>
-        <w:rPr>
-          <w:b/>
-          <w:color w:val="3F2A1E"/>
-        </w:rPr>
-        <w:t xml:space="preserve">What renovation / restoration work is planned: </w:t>
+        <w:t>What renovation / restoration work is planned:</w:t>
       </w:r>
     </w:p>
     <w:p>
       <w:pPr>
-        <w:spacing w:after="40"/>
-        <w:ind w:left="144"/>
+        <w:pStyle w:val="ListBullet"/>
+        <w:spacing w:after="60"/>
       </w:pPr>
       <w:r>
-        <w:rPr>
-          <w:rFonts w:ascii="Aptos" w:hAnsi="Aptos"/>
-          <w:color w:val="6B5A4B"/>
-          <w:sz w:val="21"/>
-        </w:rPr>
-        <w:t>________________________________________________________________________________</w:t>
+        <w:t>What work has already started:</w:t>
       </w:r>
     </w:p>
     <w:p>
       <w:pPr>
-        <w:spacing w:after="40"/>
-        <w:ind w:left="144"/>
+        <w:pStyle w:val="ListBullet"/>
+        <w:spacing w:after="60"/>
       </w:pPr>
       <w:r>
-        <w:rPr>
-          <w:rFonts w:ascii="Aptos" w:hAnsi="Aptos"/>
-          <w:color w:val="6B5A4B"/>
-          <w:sz w:val="21"/>
-        </w:rPr>
-        <w:t>________________________________________________________________________________</w:t>
+        <w:t>What do the excavation / foundation-related photos show:</w:t>
       </w:r>
     </w:p>
     <w:p>
       <w:pPr>
-        <w:spacing w:after="40"/>
-        <w:ind w:left="144"/>
+        <w:pStyle w:val="ListBullet"/>
+        <w:spacing w:after="60"/>
       </w:pPr>
       <w:r>
-        <w:rPr>
-          <w:rFonts w:ascii="Aptos" w:hAnsi="Aptos"/>
-          <w:color w:val="6B5A4B"/>
-          <w:sz w:val="21"/>
-        </w:rPr>
-        <w:t>________________________________________________________________________________</w:t>
+        <w:t>Is this restoration, renovation, strengthening, or new supporting construction:</w:t>
       </w:r>
     </w:p>
     <w:p>
       <w:pPr>
-        <w:spacing w:after="20"/>
+        <w:pStyle w:val="ListBullet"/>
+        <w:spacing w:after="60"/>
       </w:pPr>
       <w:r>
-        <w:rPr>
-          <w:b/>
-          <w:color w:val="3F2A1E"/>
-        </w:rPr>
-        <w:t xml:space="preserve">What work has already started: </w:t>
+        <w:t>Any work that should not be shown or mentioned publicly:</w:t>
       </w:r>
     </w:p>
+    <w:p/>
     <w:p>
       <w:pPr>
-        <w:spacing w:after="40"/>
-        <w:ind w:left="144"/>
+        <w:pStyle w:val="Heading1"/>
       </w:pPr>
       <w:r>
-        <w:rPr>
-          <w:rFonts w:ascii="Aptos" w:hAnsi="Aptos"/>
-          <w:color w:val="6B5A4B"/>
-          <w:sz w:val="21"/>
-        </w:rPr>
-        <w:t>________________________________________________________________________________</w:t>
-      </w:r>
-    </w:p>
-    <w:p>
-      <w:pPr>
-        <w:spacing w:after="40"/>
-        <w:ind w:left="144"/>
-      </w:pPr>
-      <w:r>
-        <w:rPr>
-          <w:rFonts w:ascii="Aptos" w:hAnsi="Aptos"/>
-          <w:color w:val="6B5A4B"/>
-          <w:sz w:val="21"/>
-        </w:rPr>
-        <w:t>________________________________________________________________________________</w:t>
-      </w:r>
-    </w:p>
-    <w:p>
-      <w:pPr>
-        <w:spacing w:after="40"/>
-        <w:ind w:left="144"/>
-      </w:pPr>
-      <w:r>
-        <w:rPr>
-          <w:rFonts w:ascii="Aptos" w:hAnsi="Aptos"/>
-          <w:color w:val="6B5A4B"/>
-          <w:sz w:val="21"/>
-        </w:rPr>
-        <w:t>________________________________________________________________________________</w:t>
-      </w:r>
-    </w:p>
-    <w:p>
-      <w:pPr>
-        <w:spacing w:after="20"/>
-      </w:pPr>
-      <w:r>
-        <w:rPr>
-          <w:b/>
-          <w:color w:val="3F2A1E"/>
-        </w:rPr>
-        <w:t xml:space="preserve">What do the excavation / foundation-related photos show: </w:t>
-      </w:r>
-    </w:p>
-    <w:p>
-      <w:pPr>
-        <w:spacing w:after="40"/>
-        <w:ind w:left="144"/>
-      </w:pPr>
-      <w:r>
-        <w:rPr>
-          <w:rFonts w:ascii="Aptos" w:hAnsi="Aptos"/>
-          <w:color w:val="6B5A4B"/>
-          <w:sz w:val="21"/>
-        </w:rPr>
-        <w:t>________________________________________________________________________________</w:t>
-      </w:r>
-    </w:p>
-    <w:p>
-      <w:pPr>
-        <w:spacing w:after="40"/>
-        <w:ind w:left="144"/>
-      </w:pPr>
-      <w:r>
-        <w:rPr>
-          <w:rFonts w:ascii="Aptos" w:hAnsi="Aptos"/>
-          <w:color w:val="6B5A4B"/>
-          <w:sz w:val="21"/>
-        </w:rPr>
-        <w:t>________________________________________________________________________________</w:t>
-      </w:r>
-    </w:p>
-    <w:p>
-      <w:pPr>
-        <w:spacing w:after="40"/>
-        <w:ind w:left="144"/>
-      </w:pPr>
-      <w:r>
-        <w:rPr>
-          <w:rFonts w:ascii="Aptos" w:hAnsi="Aptos"/>
-          <w:color w:val="6B5A4B"/>
-          <w:sz w:val="21"/>
-        </w:rPr>
-        <w:t>________________________________________________________________________________</w:t>
-      </w:r>
-    </w:p>
-    <w:p>
-      <w:pPr>
-        <w:spacing w:after="20"/>
-      </w:pPr>
-      <w:r>
-        <w:rPr>
-          <w:b/>
-          <w:color w:val="3F2A1E"/>
-        </w:rPr>
-        <w:t xml:space="preserve">Is this restoration, renovation, strengthening, or new supporting construction: </w:t>
-      </w:r>
-    </w:p>
-    <w:p>
-      <w:pPr>
-        <w:spacing w:after="40"/>
-        <w:ind w:left="144"/>
-      </w:pPr>
-      <w:r>
-        <w:rPr>
-          <w:rFonts w:ascii="Aptos" w:hAnsi="Aptos"/>
-          <w:color w:val="6B5A4B"/>
-          <w:sz w:val="21"/>
-        </w:rPr>
-        <w:t>________________________________________________________________________________</w:t>
-      </w:r>
-    </w:p>
-    <w:p>
-      <w:pPr>
-        <w:spacing w:after="20"/>
-      </w:pPr>
-      <w:r>
-        <w:rPr>
-          <w:b/>
-          <w:color w:val="3F2A1E"/>
-        </w:rPr>
-        <w:t xml:space="preserve">Any work that should not be shown or mentioned publicly: </w:t>
-      </w:r>
-    </w:p>
-    <w:p>
-      <w:pPr>
-        <w:spacing w:after="40"/>
-        <w:ind w:left="144"/>
-      </w:pPr>
-      <w:r>
-        <w:rPr>
-          <w:rFonts w:ascii="Aptos" w:hAnsi="Aptos"/>
-          <w:color w:val="6B5A4B"/>
-          <w:sz w:val="21"/>
-        </w:rPr>
-        <w:t>________________________________________________________________________________</w:t>
-      </w:r>
-    </w:p>
-    <w:p>
-      <w:pPr>
-        <w:spacing w:after="40"/>
-        <w:ind w:left="144"/>
-      </w:pPr>
-      <w:r>
-        <w:rPr>
-          <w:rFonts w:ascii="Aptos" w:hAnsi="Aptos"/>
-          <w:color w:val="6B5A4B"/>
-          <w:sz w:val="21"/>
-        </w:rPr>
-        <w:t>________________________________________________________________________________</w:t>
-      </w:r>
-    </w:p>
-    <w:p>
-      <w:pPr>
-        <w:spacing w:after="40"/>
-        <w:ind w:left="144"/>
-      </w:pPr>
-      <w:r>
-        <w:rPr>
-          <w:rFonts w:ascii="Aptos" w:hAnsi="Aptos"/>
-          <w:color w:val="6B5A4B"/>
-          <w:sz w:val="21"/>
-        </w:rPr>
-        <w:t>________________________________________________________________________________</w:t>
-      </w:r>
-    </w:p>
-    <w:p>
-      <w:r>
-        <w:br w:type="page"/>
-      </w:r>
-    </w:p>
-    <w:p>
-      <w:pPr>
-        <w:spacing w:before="240" w:after="120"/>
-      </w:pPr>
-      <w:r>
-        <w:rPr>
-          <w:rFonts w:ascii="Georgia" w:hAnsi="Georgia"/>
-          <w:b/>
-          <w:color w:val="7A1F46"/>
-          <w:sz w:val="28"/>
-        </w:rPr>
         <w:t>7. Estimated Cost And Fundraising</w:t>
       </w:r>
     </w:p>
     <w:p>
       <w:pPr>
-        <w:spacing w:after="20"/>
+        <w:pStyle w:val="ListBullet"/>
+        <w:spacing w:after="60"/>
       </w:pPr>
       <w:r>
-        <w:rPr>
-          <w:b/>
-          <w:color w:val="3F2A1E"/>
-        </w:rPr>
-        <w:t xml:space="preserve">Is the current estimate still about Rs. 25 lakhs: </w:t>
+        <w:t>Is the current estimate still about Rs. 25 lakhs:</w:t>
       </w:r>
     </w:p>
     <w:p>
       <w:pPr>
-        <w:spacing w:after="40"/>
-        <w:ind w:left="144"/>
+        <w:pStyle w:val="ListBullet"/>
+        <w:spacing w:after="60"/>
       </w:pPr>
       <w:r>
-        <w:rPr>
-          <w:rFonts w:ascii="Aptos" w:hAnsi="Aptos"/>
-          <w:color w:val="6B5A4B"/>
-          <w:sz w:val="21"/>
-        </w:rPr>
-        <w:t>________________________________________________________________________________</w:t>
+        <w:t>Or should the public page use Rs. 27 lakhs instead:</w:t>
       </w:r>
     </w:p>
     <w:p>
       <w:pPr>
-        <w:spacing w:after="20"/>
+        <w:pStyle w:val="ListBullet"/>
+        <w:spacing w:after="60"/>
       </w:pPr>
       <w:r>
-        <w:rPr>
-          <w:b/>
-          <w:color w:val="3F2A1E"/>
-        </w:rPr>
-        <w:t xml:space="preserve">How much has already been arranged: </w:t>
+        <w:t>How much has already been arranged:</w:t>
       </w:r>
     </w:p>
     <w:p>
       <w:pPr>
-        <w:spacing w:after="40"/>
-        <w:ind w:left="144"/>
+        <w:pStyle w:val="ListBullet"/>
+        <w:spacing w:after="60"/>
       </w:pPr>
       <w:r>
-        <w:rPr>
-          <w:rFonts w:ascii="Aptos" w:hAnsi="Aptos"/>
-          <w:color w:val="6B5A4B"/>
-          <w:sz w:val="21"/>
-        </w:rPr>
-        <w:t>________________________________________________________________________________</w:t>
+        <w:t>How much still needs to be raised:</w:t>
       </w:r>
     </w:p>
     <w:p>
       <w:pPr>
-        <w:spacing w:after="20"/>
+        <w:pStyle w:val="ListBullet"/>
+        <w:spacing w:after="60"/>
       </w:pPr>
       <w:r>
-        <w:rPr>
-          <w:b/>
-          <w:color w:val="3F2A1E"/>
-        </w:rPr>
-        <w:t xml:space="preserve">How much still needs to be raised: </w:t>
+        <w:t>Should this amount be shown publicly:</w:t>
       </w:r>
     </w:p>
     <w:p>
       <w:pPr>
-        <w:spacing w:after="40"/>
-        <w:ind w:left="144"/>
+        <w:pStyle w:val="ListBullet"/>
+        <w:spacing w:after="60"/>
       </w:pPr>
       <w:r>
-        <w:rPr>
-          <w:rFonts w:ascii="Aptos" w:hAnsi="Aptos"/>
-          <w:color w:val="6B5A4B"/>
-          <w:sz w:val="21"/>
-        </w:rPr>
-        <w:t>________________________________________________________________________________</w:t>
+        <w:t>Preferred wording for the donor appeal:</w:t>
       </w:r>
     </w:p>
     <w:p>
       <w:pPr>
-        <w:spacing w:after="20"/>
+        <w:pStyle w:val="ListBullet"/>
+        <w:spacing w:after="60"/>
       </w:pPr>
       <w:r>
-        <w:rPr>
-          <w:b/>
-          <w:color w:val="3F2A1E"/>
-        </w:rPr>
-        <w:t xml:space="preserve">Should this amount be shown publicly: </w:t>
+        <w:t>Is it approved to say PLM USA is contributing Rs. 10 lakhs:</w:t>
       </w:r>
     </w:p>
     <w:p>
       <w:pPr>
-        <w:spacing w:after="40"/>
-        <w:ind w:left="144"/>
+        <w:pStyle w:val="ListBullet"/>
+        <w:spacing w:after="60"/>
       </w:pPr>
       <w:r>
-        <w:rPr>
-          <w:rFonts w:ascii="Aptos" w:hAnsi="Aptos"/>
-          <w:color w:val="6B5A4B"/>
-          <w:sz w:val="21"/>
-        </w:rPr>
-        <w:t>________________________________________________________________________________</w:t>
+        <w:t>Preferred wording for listing major and minor contributors:</w:t>
       </w:r>
     </w:p>
+    <w:p/>
     <w:p>
       <w:pPr>
-        <w:spacing w:after="20"/>
+        <w:pStyle w:val="Heading1"/>
       </w:pPr>
       <w:r>
-        <w:rPr>
-          <w:b/>
-          <w:color w:val="3F2A1E"/>
-        </w:rPr>
-        <w:t xml:space="preserve">Preferred wording for the donor appeal: </w:t>
-      </w:r>
-    </w:p>
-    <w:p>
-      <w:pPr>
-        <w:spacing w:after="40"/>
-        <w:ind w:left="144"/>
-      </w:pPr>
-      <w:r>
-        <w:rPr>
-          <w:rFonts w:ascii="Aptos" w:hAnsi="Aptos"/>
-          <w:color w:val="6B5A4B"/>
-          <w:sz w:val="21"/>
-        </w:rPr>
-        <w:t>________________________________________________________________________________</w:t>
-      </w:r>
-    </w:p>
-    <w:p>
-      <w:pPr>
-        <w:spacing w:after="40"/>
-        <w:ind w:left="144"/>
-      </w:pPr>
-      <w:r>
-        <w:rPr>
-          <w:rFonts w:ascii="Aptos" w:hAnsi="Aptos"/>
-          <w:color w:val="6B5A4B"/>
-          <w:sz w:val="21"/>
-        </w:rPr>
-        <w:t>________________________________________________________________________________</w:t>
-      </w:r>
-    </w:p>
-    <w:p>
-      <w:pPr>
-        <w:spacing w:after="40"/>
-        <w:ind w:left="144"/>
-      </w:pPr>
-      <w:r>
-        <w:rPr>
-          <w:rFonts w:ascii="Aptos" w:hAnsi="Aptos"/>
-          <w:color w:val="6B5A4B"/>
-          <w:sz w:val="21"/>
-        </w:rPr>
-        <w:t>________________________________________________________________________________</w:t>
-      </w:r>
-    </w:p>
-    <w:p>
-      <w:pPr>
-        <w:spacing w:before="240" w:after="120"/>
-      </w:pPr>
-      <w:r>
-        <w:rPr>
-          <w:rFonts w:ascii="Georgia" w:hAnsi="Georgia"/>
-          <w:b/>
-          <w:color w:val="7A1F46"/>
-          <w:sz w:val="28"/>
-        </w:rPr>
         <w:t>8. Contribution Details</w:t>
       </w:r>
     </w:p>
     <w:p>
       <w:pPr>
-        <w:spacing w:after="20"/>
+        <w:pStyle w:val="ListBullet"/>
+        <w:spacing w:after="60"/>
       </w:pPr>
       <w:r>
-        <w:rPr>
-          <w:b/>
-          <w:color w:val="3F2A1E"/>
-        </w:rPr>
-        <w:t xml:space="preserve">Account name: </w:t>
+        <w:t>Account name:</w:t>
       </w:r>
     </w:p>
     <w:p>
       <w:pPr>
-        <w:spacing w:after="40"/>
-        <w:ind w:left="144"/>
+        <w:pStyle w:val="ListBullet"/>
+        <w:spacing w:after="60"/>
       </w:pPr>
       <w:r>
-        <w:rPr>
-          <w:rFonts w:ascii="Aptos" w:hAnsi="Aptos"/>
-          <w:color w:val="6B5A4B"/>
-          <w:sz w:val="21"/>
-        </w:rPr>
-        <w:t>________________________________________________________________________________</w:t>
+        <w:t>Bank name:</w:t>
       </w:r>
     </w:p>
     <w:p>
       <w:pPr>
-        <w:spacing w:after="20"/>
+        <w:pStyle w:val="ListBullet"/>
+        <w:spacing w:after="60"/>
       </w:pPr>
       <w:r>
-        <w:rPr>
-          <w:b/>
-          <w:color w:val="3F2A1E"/>
-        </w:rPr>
-        <w:t xml:space="preserve">Bank name: </w:t>
+        <w:t>Branch:</w:t>
       </w:r>
     </w:p>
     <w:p>
       <w:pPr>
-        <w:spacing w:after="40"/>
-        <w:ind w:left="144"/>
+        <w:pStyle w:val="ListBullet"/>
+        <w:spacing w:after="60"/>
       </w:pPr>
       <w:r>
-        <w:rPr>
-          <w:rFonts w:ascii="Aptos" w:hAnsi="Aptos"/>
-          <w:color w:val="6B5A4B"/>
-          <w:sz w:val="21"/>
-        </w:rPr>
-        <w:t>________________________________________________________________________________</w:t>
+        <w:t>Account number:</w:t>
       </w:r>
     </w:p>
     <w:p>
       <w:pPr>
-        <w:spacing w:after="20"/>
+        <w:pStyle w:val="ListBullet"/>
+        <w:spacing w:after="60"/>
       </w:pPr>
       <w:r>
-        <w:rPr>
-          <w:b/>
-          <w:color w:val="3F2A1E"/>
-        </w:rPr>
-        <w:t xml:space="preserve">Branch: </w:t>
+        <w:t>IFSC:</w:t>
       </w:r>
     </w:p>
     <w:p>
       <w:pPr>
-        <w:spacing w:after="40"/>
-        <w:ind w:left="144"/>
+        <w:pStyle w:val="ListBullet"/>
+        <w:spacing w:after="60"/>
       </w:pPr>
       <w:r>
-        <w:rPr>
-          <w:rFonts w:ascii="Aptos" w:hAnsi="Aptos"/>
-          <w:color w:val="6B5A4B"/>
-          <w:sz w:val="21"/>
-        </w:rPr>
-        <w:t>________________________________________________________________________________</w:t>
+        <w:t>UPI ID:</w:t>
       </w:r>
     </w:p>
     <w:p>
       <w:pPr>
-        <w:spacing w:after="20"/>
+        <w:pStyle w:val="ListBullet"/>
+        <w:spacing w:after="60"/>
       </w:pPr>
       <w:r>
-        <w:rPr>
-          <w:b/>
-          <w:color w:val="3F2A1E"/>
-        </w:rPr>
-        <w:t xml:space="preserve">Account number: </w:t>
+        <w:t>QR code available:</w:t>
       </w:r>
     </w:p>
     <w:p>
       <w:pPr>
-        <w:spacing w:after="40"/>
-        <w:ind w:left="144"/>
+        <w:pStyle w:val="ListBullet"/>
+        <w:spacing w:after="60"/>
       </w:pPr>
       <w:r>
-        <w:rPr>
-          <w:rFonts w:ascii="Aptos" w:hAnsi="Aptos"/>
-          <w:color w:val="6B5A4B"/>
-          <w:sz w:val="21"/>
-        </w:rPr>
-        <w:t>________________________________________________________________________________</w:t>
+        <w:t>Contact person for donations:</w:t>
       </w:r>
     </w:p>
     <w:p>
       <w:pPr>
-        <w:spacing w:after="20"/>
+        <w:pStyle w:val="ListBullet"/>
+        <w:spacing w:after="60"/>
       </w:pPr>
       <w:r>
-        <w:rPr>
-          <w:b/>
-          <w:color w:val="3F2A1E"/>
-        </w:rPr>
-        <w:t xml:space="preserve">IFSC: </w:t>
+        <w:t>Phone:</w:t>
       </w:r>
     </w:p>
     <w:p>
       <w:pPr>
-        <w:spacing w:after="40"/>
-        <w:ind w:left="144"/>
+        <w:pStyle w:val="ListBullet"/>
+        <w:spacing w:after="60"/>
       </w:pPr>
       <w:r>
-        <w:rPr>
-          <w:rFonts w:ascii="Aptos" w:hAnsi="Aptos"/>
-          <w:color w:val="6B5A4B"/>
-          <w:sz w:val="21"/>
-        </w:rPr>
-        <w:t>________________________________________________________________________________</w:t>
+        <w:t>Email:</w:t>
       </w:r>
     </w:p>
     <w:p>
       <w:pPr>
-        <w:spacing w:after="20"/>
+        <w:pStyle w:val="ListBullet"/>
+        <w:spacing w:after="60"/>
       </w:pPr>
       <w:r>
-        <w:rPr>
-          <w:b/>
-          <w:color w:val="3F2A1E"/>
-        </w:rPr>
-        <w:t xml:space="preserve">UPI ID: </w:t>
+        <w:t>Which contribution details can be shown publicly:</w:t>
       </w:r>
     </w:p>
     <w:p>
       <w:pPr>
-        <w:spacing w:after="40"/>
-        <w:ind w:left="144"/>
+        <w:pStyle w:val="ListBullet"/>
+        <w:spacing w:after="60"/>
       </w:pPr>
       <w:r>
-        <w:rPr>
-          <w:rFonts w:ascii="Aptos" w:hAnsi="Aptos"/>
-          <w:color w:val="6B5A4B"/>
-          <w:sz w:val="21"/>
-        </w:rPr>
-        <w:t>________________________________________________________________________________</w:t>
+        <w:t>Should the page encourage immediate / direct contributions on the same page:</w:t>
       </w:r>
     </w:p>
+    <w:p/>
     <w:p>
       <w:pPr>
-        <w:spacing w:after="20"/>
+        <w:pStyle w:val="Heading1"/>
       </w:pPr>
       <w:r>
-        <w:rPr>
-          <w:b/>
-          <w:color w:val="3F2A1E"/>
-        </w:rPr>
-        <w:t xml:space="preserve">QR code available: </w:t>
-      </w:r>
-    </w:p>
-    <w:p>
-      <w:pPr>
-        <w:spacing w:after="40"/>
-        <w:ind w:left="144"/>
-      </w:pPr>
-      <w:r>
-        <w:rPr>
-          <w:rFonts w:ascii="Aptos" w:hAnsi="Aptos"/>
-          <w:color w:val="6B5A4B"/>
-          <w:sz w:val="21"/>
-        </w:rPr>
-        <w:t>________________________________________________________________________________</w:t>
-      </w:r>
-    </w:p>
-    <w:p>
-      <w:pPr>
-        <w:spacing w:after="20"/>
-      </w:pPr>
-      <w:r>
-        <w:rPr>
-          <w:b/>
-          <w:color w:val="3F2A1E"/>
-        </w:rPr>
-        <w:t xml:space="preserve">Contact person for donations: </w:t>
-      </w:r>
-    </w:p>
-    <w:p>
-      <w:pPr>
-        <w:spacing w:after="40"/>
-        <w:ind w:left="144"/>
-      </w:pPr>
-      <w:r>
-        <w:rPr>
-          <w:rFonts w:ascii="Aptos" w:hAnsi="Aptos"/>
-          <w:color w:val="6B5A4B"/>
-          <w:sz w:val="21"/>
-        </w:rPr>
-        <w:t>________________________________________________________________________________</w:t>
-      </w:r>
-    </w:p>
-    <w:p>
-      <w:pPr>
-        <w:spacing w:after="20"/>
-      </w:pPr>
-      <w:r>
-        <w:rPr>
-          <w:b/>
-          <w:color w:val="3F2A1E"/>
-        </w:rPr>
-        <w:t xml:space="preserve">Phone: </w:t>
-      </w:r>
-    </w:p>
-    <w:p>
-      <w:pPr>
-        <w:spacing w:after="40"/>
-        <w:ind w:left="144"/>
-      </w:pPr>
-      <w:r>
-        <w:rPr>
-          <w:rFonts w:ascii="Aptos" w:hAnsi="Aptos"/>
-          <w:color w:val="6B5A4B"/>
-          <w:sz w:val="21"/>
-        </w:rPr>
-        <w:t>________________________________________________________________________________</w:t>
-      </w:r>
-    </w:p>
-    <w:p>
-      <w:pPr>
-        <w:spacing w:after="20"/>
-      </w:pPr>
-      <w:r>
-        <w:rPr>
-          <w:b/>
-          <w:color w:val="3F2A1E"/>
-        </w:rPr>
-        <w:t xml:space="preserve">Email: </w:t>
-      </w:r>
-    </w:p>
-    <w:p>
-      <w:pPr>
-        <w:spacing w:after="40"/>
-        <w:ind w:left="144"/>
-      </w:pPr>
-      <w:r>
-        <w:rPr>
-          <w:rFonts w:ascii="Aptos" w:hAnsi="Aptos"/>
-          <w:color w:val="6B5A4B"/>
-          <w:sz w:val="21"/>
-        </w:rPr>
-        <w:t>________________________________________________________________________________</w:t>
-      </w:r>
-    </w:p>
-    <w:p>
-      <w:pPr>
-        <w:spacing w:after="20"/>
-      </w:pPr>
-      <w:r>
-        <w:rPr>
-          <w:b/>
-          <w:color w:val="3F2A1E"/>
-        </w:rPr>
-        <w:t xml:space="preserve">Which contribution details can be shown publicly: </w:t>
-      </w:r>
-    </w:p>
-    <w:p>
-      <w:pPr>
-        <w:spacing w:after="40"/>
-        <w:ind w:left="144"/>
-      </w:pPr>
-      <w:r>
-        <w:rPr>
-          <w:rFonts w:ascii="Aptos" w:hAnsi="Aptos"/>
-          <w:color w:val="6B5A4B"/>
-          <w:sz w:val="21"/>
-        </w:rPr>
-        <w:t>________________________________________________________________________________</w:t>
-      </w:r>
-    </w:p>
-    <w:p>
-      <w:pPr>
-        <w:spacing w:after="40"/>
-        <w:ind w:left="144"/>
-      </w:pPr>
-      <w:r>
-        <w:rPr>
-          <w:rFonts w:ascii="Aptos" w:hAnsi="Aptos"/>
-          <w:color w:val="6B5A4B"/>
-          <w:sz w:val="21"/>
-        </w:rPr>
-        <w:t>________________________________________________________________________________</w:t>
-      </w:r>
-    </w:p>
-    <w:p>
-      <w:pPr>
-        <w:spacing w:after="40"/>
-        <w:ind w:left="144"/>
-      </w:pPr>
-      <w:r>
-        <w:rPr>
-          <w:rFonts w:ascii="Aptos" w:hAnsi="Aptos"/>
-          <w:color w:val="6B5A4B"/>
-          <w:sz w:val="21"/>
-        </w:rPr>
-        <w:t>________________________________________________________________________________</w:t>
-      </w:r>
-    </w:p>
-    <w:p>
-      <w:r>
-        <w:br w:type="page"/>
-      </w:r>
-    </w:p>
-    <w:p>
-      <w:pPr>
-        <w:spacing w:before="240" w:after="120"/>
-      </w:pPr>
-      <w:r>
-        <w:rPr>
-          <w:rFonts w:ascii="Georgia" w:hAnsi="Georgia"/>
-          <w:b/>
-          <w:color w:val="7A1F46"/>
-          <w:sz w:val="28"/>
-        </w:rPr>
         <w:t>9. People To Mention Publicly</w:t>
       </w:r>
     </w:p>
     <w:p>
       <w:pPr>
-        <w:spacing w:after="20"/>
+        <w:pStyle w:val="ListBullet"/>
+        <w:spacing w:after="60"/>
       </w:pPr>
       <w:r>
-        <w:rPr>
-          <w:b/>
-          <w:color w:val="3F2A1E"/>
-        </w:rPr>
-        <w:t xml:space="preserve">Principal / local manager / trustee names to mention: </w:t>
+        <w:t>Principal / local manager / trustee names to mention:</w:t>
       </w:r>
     </w:p>
     <w:p>
       <w:pPr>
-        <w:spacing w:after="40"/>
-        <w:ind w:left="144"/>
+        <w:pStyle w:val="ListBullet"/>
+        <w:spacing w:after="60"/>
       </w:pPr>
       <w:r>
-        <w:rPr>
-          <w:rFonts w:ascii="Aptos" w:hAnsi="Aptos"/>
-          <w:color w:val="6B5A4B"/>
-          <w:sz w:val="21"/>
-        </w:rPr>
-        <w:t>________________________________________________________________________________</w:t>
+        <w:t>Designations:</w:t>
       </w:r>
     </w:p>
     <w:p>
       <w:pPr>
-        <w:spacing w:after="20"/>
+        <w:pStyle w:val="ListBullet"/>
+        <w:spacing w:after="60"/>
       </w:pPr>
       <w:r>
-        <w:rPr>
-          <w:b/>
-          <w:color w:val="3F2A1E"/>
-        </w:rPr>
-        <w:t xml:space="preserve">Designations: </w:t>
+        <w:t>Any Acharya approval wording to include:</w:t>
       </w:r>
     </w:p>
     <w:p>
       <w:pPr>
-        <w:spacing w:after="40"/>
-        <w:ind w:left="144"/>
+        <w:pStyle w:val="ListBullet"/>
+        <w:spacing w:after="60"/>
       </w:pPr>
       <w:r>
-        <w:rPr>
-          <w:rFonts w:ascii="Aptos" w:hAnsi="Aptos"/>
-          <w:color w:val="6B5A4B"/>
-          <w:sz w:val="21"/>
-        </w:rPr>
-        <w:t>________________________________________________________________________________</w:t>
+        <w:t>Names that should not be mentioned publicly:</w:t>
       </w:r>
     </w:p>
+    <w:p/>
     <w:p>
       <w:pPr>
-        <w:spacing w:after="20"/>
+        <w:pStyle w:val="Heading1"/>
       </w:pPr>
       <w:r>
-        <w:rPr>
-          <w:b/>
-          <w:color w:val="3F2A1E"/>
-        </w:rPr>
-        <w:t xml:space="preserve">Any Acharya approval wording to include: </w:t>
-      </w:r>
-    </w:p>
-    <w:p>
-      <w:pPr>
-        <w:spacing w:after="40"/>
-        <w:ind w:left="144"/>
-      </w:pPr>
-      <w:r>
-        <w:rPr>
-          <w:rFonts w:ascii="Aptos" w:hAnsi="Aptos"/>
-          <w:color w:val="6B5A4B"/>
-          <w:sz w:val="21"/>
-        </w:rPr>
-        <w:t>________________________________________________________________________________</w:t>
-      </w:r>
-    </w:p>
-    <w:p>
-      <w:pPr>
-        <w:spacing w:after="40"/>
-        <w:ind w:left="144"/>
-      </w:pPr>
-      <w:r>
-        <w:rPr>
-          <w:rFonts w:ascii="Aptos" w:hAnsi="Aptos"/>
-          <w:color w:val="6B5A4B"/>
-          <w:sz w:val="21"/>
-        </w:rPr>
-        <w:t>________________________________________________________________________________</w:t>
-      </w:r>
-    </w:p>
-    <w:p>
-      <w:pPr>
-        <w:spacing w:after="40"/>
-        <w:ind w:left="144"/>
-      </w:pPr>
-      <w:r>
-        <w:rPr>
-          <w:rFonts w:ascii="Aptos" w:hAnsi="Aptos"/>
-          <w:color w:val="6B5A4B"/>
-          <w:sz w:val="21"/>
-        </w:rPr>
-        <w:t>________________________________________________________________________________</w:t>
-      </w:r>
-    </w:p>
-    <w:p>
-      <w:pPr>
-        <w:spacing w:after="20"/>
-      </w:pPr>
-      <w:r>
-        <w:rPr>
-          <w:b/>
-          <w:color w:val="3F2A1E"/>
-        </w:rPr>
-        <w:t xml:space="preserve">Names that should not be mentioned publicly: </w:t>
-      </w:r>
-    </w:p>
-    <w:p>
-      <w:pPr>
-        <w:spacing w:after="40"/>
-        <w:ind w:left="144"/>
-      </w:pPr>
-      <w:r>
-        <w:rPr>
-          <w:rFonts w:ascii="Aptos" w:hAnsi="Aptos"/>
-          <w:color w:val="6B5A4B"/>
-          <w:sz w:val="21"/>
-        </w:rPr>
-        <w:t>________________________________________________________________________________</w:t>
-      </w:r>
-    </w:p>
-    <w:p>
-      <w:pPr>
-        <w:spacing w:before="240" w:after="120"/>
-      </w:pPr>
-      <w:r>
-        <w:rPr>
-          <w:rFonts w:ascii="Georgia" w:hAnsi="Georgia"/>
-          <w:b/>
-          <w:color w:val="7A1F46"/>
-          <w:sz w:val="28"/>
-        </w:rPr>
         <w:t>10. Page Content Changes Requested</w:t>
       </w:r>
     </w:p>
     <w:p>
       <w:pPr>
-        <w:spacing w:after="20"/>
+        <w:pStyle w:val="ListBullet"/>
+        <w:spacing w:after="60"/>
       </w:pPr>
       <w:r>
-        <w:rPr>
-          <w:b/>
-          <w:color w:val="3F2A1E"/>
-        </w:rPr>
-        <w:t xml:space="preserve">Please remove this item: </w:t>
+        <w:t>Please remove this item:</w:t>
       </w:r>
     </w:p>
     <w:p>
       <w:pPr>
-        <w:spacing w:after="40"/>
-        <w:ind w:left="144"/>
+        <w:pStyle w:val="ListBullet"/>
+        <w:spacing w:after="60"/>
       </w:pPr>
       <w:r>
-        <w:rPr>
-          <w:rFonts w:ascii="Aptos" w:hAnsi="Aptos"/>
-          <w:color w:val="6B5A4B"/>
-          <w:sz w:val="21"/>
-        </w:rPr>
-        <w:t>________________________________________________________________________________</w:t>
+        <w:t>Please add this item:</w:t>
       </w:r>
     </w:p>
     <w:p>
       <w:pPr>
-        <w:spacing w:after="40"/>
-        <w:ind w:left="144"/>
+        <w:pStyle w:val="ListBullet"/>
+        <w:spacing w:after="60"/>
       </w:pPr>
       <w:r>
-        <w:rPr>
-          <w:rFonts w:ascii="Aptos" w:hAnsi="Aptos"/>
-          <w:color w:val="6B5A4B"/>
-          <w:sz w:val="21"/>
-        </w:rPr>
-        <w:t>________________________________________________________________________________</w:t>
+        <w:t>Please change this wording:</w:t>
       </w:r>
     </w:p>
     <w:p>
       <w:pPr>
-        <w:spacing w:after="40"/>
-        <w:ind w:left="144"/>
+        <w:pStyle w:val="ListBullet"/>
+        <w:spacing w:after="60"/>
       </w:pPr>
       <w:r>
-        <w:rPr>
-          <w:rFonts w:ascii="Aptos" w:hAnsi="Aptos"/>
-          <w:color w:val="6B5A4B"/>
-          <w:sz w:val="21"/>
-        </w:rPr>
-        <w:t>________________________________________________________________________________</w:t>
+        <w:t>Please change the tone:</w:t>
       </w:r>
     </w:p>
     <w:p>
       <w:pPr>
-        <w:spacing w:after="20"/>
+        <w:pStyle w:val="ListBullet"/>
+        <w:spacing w:after="60"/>
       </w:pPr>
       <w:r>
-        <w:rPr>
-          <w:b/>
-          <w:color w:val="3F2A1E"/>
-        </w:rPr>
-        <w:t xml:space="preserve">Please add this item: </w:t>
+        <w:t>Please change the order / structure:</w:t>
       </w:r>
     </w:p>
     <w:p>
       <w:pPr>
-        <w:spacing w:after="40"/>
-        <w:ind w:left="144"/>
+        <w:pStyle w:val="ListBullet"/>
+        <w:spacing w:after="60"/>
       </w:pPr>
       <w:r>
-        <w:rPr>
-          <w:rFonts w:ascii="Aptos" w:hAnsi="Aptos"/>
-          <w:color w:val="6B5A4B"/>
-          <w:sz w:val="21"/>
-        </w:rPr>
-        <w:t>________________________________________________________________________________</w:t>
+        <w:t>Please add any quote / slokam / traditional wording:</w:t>
       </w:r>
     </w:p>
+    <w:p/>
     <w:p>
       <w:pPr>
-        <w:spacing w:after="40"/>
-        <w:ind w:left="144"/>
+        <w:pStyle w:val="Heading1"/>
       </w:pPr>
       <w:r>
-        <w:rPr>
-          <w:rFonts w:ascii="Aptos" w:hAnsi="Aptos"/>
-          <w:color w:val="6B5A4B"/>
-          <w:sz w:val="21"/>
-        </w:rPr>
-        <w:t>________________________________________________________________________________</w:t>
-      </w:r>
-    </w:p>
-    <w:p>
-      <w:pPr>
-        <w:spacing w:after="40"/>
-        <w:ind w:left="144"/>
-      </w:pPr>
-      <w:r>
-        <w:rPr>
-          <w:rFonts w:ascii="Aptos" w:hAnsi="Aptos"/>
-          <w:color w:val="6B5A4B"/>
-          <w:sz w:val="21"/>
-        </w:rPr>
-        <w:t>________________________________________________________________________________</w:t>
-      </w:r>
-    </w:p>
-    <w:p>
-      <w:pPr>
-        <w:spacing w:after="20"/>
-      </w:pPr>
-      <w:r>
-        <w:rPr>
-          <w:b/>
-          <w:color w:val="3F2A1E"/>
-        </w:rPr>
-        <w:t xml:space="preserve">Please change this wording: </w:t>
-      </w:r>
-    </w:p>
-    <w:p>
-      <w:pPr>
-        <w:spacing w:after="40"/>
-        <w:ind w:left="144"/>
-      </w:pPr>
-      <w:r>
-        <w:rPr>
-          <w:rFonts w:ascii="Aptos" w:hAnsi="Aptos"/>
-          <w:color w:val="6B5A4B"/>
-          <w:sz w:val="21"/>
-        </w:rPr>
-        <w:t>________________________________________________________________________________</w:t>
-      </w:r>
-    </w:p>
-    <w:p>
-      <w:pPr>
-        <w:spacing w:after="40"/>
-        <w:ind w:left="144"/>
-      </w:pPr>
-      <w:r>
-        <w:rPr>
-          <w:rFonts w:ascii="Aptos" w:hAnsi="Aptos"/>
-          <w:color w:val="6B5A4B"/>
-          <w:sz w:val="21"/>
-        </w:rPr>
-        <w:t>________________________________________________________________________________</w:t>
-      </w:r>
-    </w:p>
-    <w:p>
-      <w:pPr>
-        <w:spacing w:after="40"/>
-        <w:ind w:left="144"/>
-      </w:pPr>
-      <w:r>
-        <w:rPr>
-          <w:rFonts w:ascii="Aptos" w:hAnsi="Aptos"/>
-          <w:color w:val="6B5A4B"/>
-          <w:sz w:val="21"/>
-        </w:rPr>
-        <w:t>________________________________________________________________________________</w:t>
-      </w:r>
-    </w:p>
-    <w:p>
-      <w:pPr>
-        <w:spacing w:after="20"/>
-      </w:pPr>
-      <w:r>
-        <w:rPr>
-          <w:b/>
-          <w:color w:val="3F2A1E"/>
-        </w:rPr>
-        <w:t xml:space="preserve">Please change the tone: </w:t>
-      </w:r>
-    </w:p>
-    <w:p>
-      <w:pPr>
-        <w:spacing w:after="40"/>
-        <w:ind w:left="144"/>
-      </w:pPr>
-      <w:r>
-        <w:rPr>
-          <w:rFonts w:ascii="Aptos" w:hAnsi="Aptos"/>
-          <w:color w:val="6B5A4B"/>
-          <w:sz w:val="21"/>
-        </w:rPr>
-        <w:t>________________________________________________________________________________</w:t>
-      </w:r>
-    </w:p>
-    <w:p>
-      <w:pPr>
-        <w:spacing w:after="40"/>
-        <w:ind w:left="144"/>
-      </w:pPr>
-      <w:r>
-        <w:rPr>
-          <w:rFonts w:ascii="Aptos" w:hAnsi="Aptos"/>
-          <w:color w:val="6B5A4B"/>
-          <w:sz w:val="21"/>
-        </w:rPr>
-        <w:t>________________________________________________________________________________</w:t>
-      </w:r>
-    </w:p>
-    <w:p>
-      <w:pPr>
-        <w:spacing w:after="40"/>
-        <w:ind w:left="144"/>
-      </w:pPr>
-      <w:r>
-        <w:rPr>
-          <w:rFonts w:ascii="Aptos" w:hAnsi="Aptos"/>
-          <w:color w:val="6B5A4B"/>
-          <w:sz w:val="21"/>
-        </w:rPr>
-        <w:t>________________________________________________________________________________</w:t>
-      </w:r>
-    </w:p>
-    <w:p>
-      <w:pPr>
-        <w:spacing w:after="20"/>
-      </w:pPr>
-      <w:r>
-        <w:rPr>
-          <w:b/>
-          <w:color w:val="3F2A1E"/>
-        </w:rPr>
-        <w:t xml:space="preserve">Please change the order / structure: </w:t>
-      </w:r>
-    </w:p>
-    <w:p>
-      <w:pPr>
-        <w:spacing w:after="40"/>
-        <w:ind w:left="144"/>
-      </w:pPr>
-      <w:r>
-        <w:rPr>
-          <w:rFonts w:ascii="Aptos" w:hAnsi="Aptos"/>
-          <w:color w:val="6B5A4B"/>
-          <w:sz w:val="21"/>
-        </w:rPr>
-        <w:t>________________________________________________________________________________</w:t>
-      </w:r>
-    </w:p>
-    <w:p>
-      <w:pPr>
-        <w:spacing w:after="40"/>
-        <w:ind w:left="144"/>
-      </w:pPr>
-      <w:r>
-        <w:rPr>
-          <w:rFonts w:ascii="Aptos" w:hAnsi="Aptos"/>
-          <w:color w:val="6B5A4B"/>
-          <w:sz w:val="21"/>
-        </w:rPr>
-        <w:t>________________________________________________________________________________</w:t>
-      </w:r>
-    </w:p>
-    <w:p>
-      <w:pPr>
-        <w:spacing w:after="40"/>
-        <w:ind w:left="144"/>
-      </w:pPr>
-      <w:r>
-        <w:rPr>
-          <w:rFonts w:ascii="Aptos" w:hAnsi="Aptos"/>
-          <w:color w:val="6B5A4B"/>
-          <w:sz w:val="21"/>
-        </w:rPr>
-        <w:t>________________________________________________________________________________</w:t>
-      </w:r>
-    </w:p>
-    <w:p>
-      <w:pPr>
-        <w:spacing w:after="20"/>
-      </w:pPr>
-      <w:r>
-        <w:rPr>
-          <w:b/>
-          <w:color w:val="3F2A1E"/>
-        </w:rPr>
-        <w:t xml:space="preserve">Please add any quote / slokam / traditional wording: </w:t>
-      </w:r>
-    </w:p>
-    <w:p>
-      <w:pPr>
-        <w:spacing w:after="40"/>
-        <w:ind w:left="144"/>
-      </w:pPr>
-      <w:r>
-        <w:rPr>
-          <w:rFonts w:ascii="Aptos" w:hAnsi="Aptos"/>
-          <w:color w:val="6B5A4B"/>
-          <w:sz w:val="21"/>
-        </w:rPr>
-        <w:t>________________________________________________________________________________</w:t>
-      </w:r>
-    </w:p>
-    <w:p>
-      <w:pPr>
-        <w:spacing w:after="40"/>
-        <w:ind w:left="144"/>
-      </w:pPr>
-      <w:r>
-        <w:rPr>
-          <w:rFonts w:ascii="Aptos" w:hAnsi="Aptos"/>
-          <w:color w:val="6B5A4B"/>
-          <w:sz w:val="21"/>
-        </w:rPr>
-        <w:t>________________________________________________________________________________</w:t>
-      </w:r>
-    </w:p>
-    <w:p>
-      <w:pPr>
-        <w:spacing w:after="40"/>
-        <w:ind w:left="144"/>
-      </w:pPr>
-      <w:r>
-        <w:rPr>
-          <w:rFonts w:ascii="Aptos" w:hAnsi="Aptos"/>
-          <w:color w:val="6B5A4B"/>
-          <w:sz w:val="21"/>
-        </w:rPr>
-        <w:t>________________________________________________________________________________</w:t>
-      </w:r>
-    </w:p>
-    <w:p>
-      <w:r>
-        <w:br w:type="page"/>
-      </w:r>
-    </w:p>
-    <w:p>
-      <w:pPr>
-        <w:spacing w:before="240" w:after="120"/>
-      </w:pPr>
-      <w:r>
-        <w:rPr>
-          <w:rFonts w:ascii="Georgia" w:hAnsi="Georgia"/>
-          <w:b/>
-          <w:color w:val="7A1F46"/>
-          <w:sz w:val="28"/>
-        </w:rPr>
         <w:t>11. Media Guidance</w:t>
       </w:r>
     </w:p>
     <w:p>
       <w:pPr>
-        <w:spacing w:after="20"/>
+        <w:pStyle w:val="ListBullet"/>
+        <w:spacing w:after="60"/>
       </w:pPr>
       <w:r>
-        <w:rPr>
-          <w:b/>
-          <w:color w:val="3F2A1E"/>
-        </w:rPr>
-        <w:t xml:space="preserve">Which photos must be used: </w:t>
+        <w:t>Which photos must be used:</w:t>
       </w:r>
     </w:p>
     <w:p>
       <w:pPr>
-        <w:spacing w:after="40"/>
-        <w:ind w:left="144"/>
+        <w:pStyle w:val="ListBullet"/>
+        <w:spacing w:after="60"/>
       </w:pPr>
       <w:r>
-        <w:rPr>
-          <w:rFonts w:ascii="Aptos" w:hAnsi="Aptos"/>
-          <w:color w:val="6B5A4B"/>
-          <w:sz w:val="21"/>
-        </w:rPr>
-        <w:t>________________________________________________________________________________</w:t>
+        <w:t>Which photos should not be used:</w:t>
       </w:r>
     </w:p>
     <w:p>
       <w:pPr>
-        <w:spacing w:after="20"/>
+        <w:pStyle w:val="ListBullet"/>
+        <w:spacing w:after="60"/>
       </w:pPr>
       <w:r>
-        <w:rPr>
-          <w:b/>
-          <w:color w:val="3F2A1E"/>
-        </w:rPr>
-        <w:t xml:space="preserve">Which photos should not be used: </w:t>
+        <w:t>Captions or explanations for the current photos:</w:t>
       </w:r>
     </w:p>
     <w:p>
       <w:pPr>
-        <w:spacing w:after="40"/>
-        <w:ind w:left="144"/>
+        <w:pStyle w:val="ListBullet"/>
+        <w:spacing w:after="60"/>
       </w:pPr>
       <w:r>
-        <w:rPr>
-          <w:rFonts w:ascii="Aptos" w:hAnsi="Aptos"/>
-          <w:color w:val="6B5A4B"/>
-          <w:sz w:val="21"/>
-        </w:rPr>
-        <w:t>________________________________________________________________________________</w:t>
-      </w:r>
-    </w:p>
-    <w:p>
-      <w:pPr>
-        <w:spacing w:after="20"/>
-      </w:pPr>
-      <w:r>
-        <w:rPr>
-          <w:b/>
-          <w:color w:val="3F2A1E"/>
-        </w:rPr>
-        <w:t xml:space="preserve">Captions or explanations for the current photos: </w:t>
-      </w:r>
-    </w:p>
-    <w:p>
-      <w:pPr>
-        <w:spacing w:after="40"/>
-        <w:ind w:left="144"/>
-      </w:pPr>
-      <w:r>
-        <w:rPr>
-          <w:rFonts w:ascii="Aptos" w:hAnsi="Aptos"/>
-          <w:color w:val="6B5A4B"/>
-          <w:sz w:val="21"/>
-        </w:rPr>
-        <w:t>________________________________________________________________________________</w:t>
-      </w:r>
-    </w:p>
-    <w:p>
-      <w:pPr>
-        <w:spacing w:after="40"/>
-        <w:ind w:left="144"/>
-      </w:pPr>
-      <w:r>
-        <w:rPr>
-          <w:rFonts w:ascii="Aptos" w:hAnsi="Aptos"/>
-          <w:color w:val="6B5A4B"/>
-          <w:sz w:val="21"/>
-        </w:rPr>
-        <w:t>________________________________________________________________________________</w:t>
-      </w:r>
-    </w:p>
-    <w:p>
-      <w:pPr>
-        <w:spacing w:after="40"/>
-        <w:ind w:left="144"/>
-      </w:pPr>
-      <w:r>
-        <w:rPr>
-          <w:rFonts w:ascii="Aptos" w:hAnsi="Aptos"/>
-          <w:color w:val="6B5A4B"/>
-          <w:sz w:val="21"/>
-        </w:rPr>
-        <w:t>________________________________________________________________________________</w:t>
-      </w:r>
-    </w:p>
-    <w:p>
-      <w:pPr>
-        <w:spacing w:after="20"/>
-      </w:pPr>
-      <w:r>
-        <w:rPr>
-          <w:b/>
-          <w:color w:val="3F2A1E"/>
-        </w:rPr>
-        <w:t xml:space="preserve">Any additional photos available: </w:t>
-      </w:r>
-    </w:p>
-    <w:p>
-      <w:pPr>
-        <w:spacing w:after="40"/>
-        <w:ind w:left="144"/>
-      </w:pPr>
-      <w:r>
-        <w:rPr>
-          <w:rFonts w:ascii="Aptos" w:hAnsi="Aptos"/>
-          <w:color w:val="6B5A4B"/>
-          <w:sz w:val="21"/>
-        </w:rPr>
-        <w:t>________________________________________________________________________________</w:t>
-      </w:r>
-    </w:p>
-    <w:p>
-      <w:pPr>
-        <w:spacing w:after="40"/>
-        <w:ind w:left="144"/>
-      </w:pPr>
-      <w:r>
-        <w:rPr>
-          <w:rFonts w:ascii="Aptos" w:hAnsi="Aptos"/>
-          <w:color w:val="6B5A4B"/>
-          <w:sz w:val="21"/>
-        </w:rPr>
-        <w:t>________________________________________________________________________________</w:t>
-      </w:r>
-    </w:p>
-    <w:p>
-      <w:pPr>
-        <w:spacing w:after="40"/>
-        <w:ind w:left="144"/>
-      </w:pPr>
-      <w:r>
-        <w:rPr>
-          <w:rFonts w:ascii="Aptos" w:hAnsi="Aptos"/>
-          <w:color w:val="6B5A4B"/>
-          <w:sz w:val="21"/>
-        </w:rPr>
-        <w:t>________________________________________________________________________________</w:t>
+        <w:t>Any additional photos available:</w:t>
       </w:r>
     </w:p>
     <w:sectPr>
+      <w:footerReference w:type="default" r:id="rId9"/>
       <w:pgSz w:w="12240" w:h="15840"/>
-      <w:pgMar w:top="864" w:right="1080" w:bottom="864" w:left="1080" w:header="720" w:footer="720" w:gutter="0"/>
+      <w:pgMar w:top="936" w:right="1080" w:bottom="936" w:left="1080" w:header="720" w:footer="720" w:gutter="0"/>
       <w:cols w:space="720"/>
       <w:docGrid w:linePitch="360"/>
     </w:sectPr>
   </w:body>
 </w:document>
+</file>
+
+<file path=word/footer1.xml><?xml version="1.0" encoding="utf-8"?>
+<w:ftr xmlns:m="http://schemas.openxmlformats.org/officeDocument/2006/math" xmlns:mc="http://schemas.openxmlformats.org/markup-compatibility/2006" xmlns:mo="http://schemas.microsoft.com/office/mac/office/2008/main" xmlns:mv="urn:schemas-microsoft-com:mac:vml" xmlns:o="urn:schemas-microsoft-com:office:office" xmlns:r="http://schemas.openxmlformats.org/officeDocument/2006/relationships" xmlns:v="urn:schemas-microsoft-com:vml" xmlns:w10="urn:schemas-microsoft-com:office:word" xmlns:w14="http://schemas.microsoft.com/office/word/2010/wordml" xmlns:w="http://schemas.openxmlformats.org/wordprocessingml/2006/main" xmlns:wne="http://schemas.microsoft.com/office/word/2006/wordml" xmlns:wp14="http://schemas.microsoft.com/office/word/2010/wordprocessingDrawing" xmlns:wp="http://schemas.openxmlformats.org/drawingml/2006/wordprocessingDrawing" xmlns:wpc="http://schemas.microsoft.com/office/word/2010/wordprocessingCanvas" xmlns:wpg="http://schemas.microsoft.com/office/word/2010/wordprocessingGroup" xmlns:wpi="http://schemas.microsoft.com/office/word/2010/wordprocessingInk" xmlns:wps="http://schemas.microsoft.com/office/word/2010/wordprocessingShape" mc:Ignorable="w14 wp14">
+  <w:p>
+    <w:pPr>
+      <w:pStyle w:val="Footer"/>
+      <w:jc w:val="center"/>
+    </w:pPr>
+    <w:r>
+      <w:rPr>
+        <w:color w:val="6B5848"/>
+        <w:sz w:val="18"/>
+      </w:rPr>
+      <w:t>Working questionnaire for principal and trustee review</w:t>
+    </w:r>
+  </w:p>
+</w:ftr>
 </file>
 
 <file path=word/numbering.xml><?xml version="1.0" encoding="utf-8"?>
@@ -2939,7 +1257,7 @@
     <w:qFormat/>
     <w:rsid w:val="00FC693F"/>
     <w:rPr>
-      <w:rFonts w:ascii="Aptos" w:hAnsi="Aptos"/>
+      <w:rFonts w:ascii="Aptos" w:hAnsi="Aptos" w:eastAsia="Aptos"/>
       <w:sz w:val="21"/>
     </w:rPr>
   </w:style>
@@ -3002,10 +1320,10 @@
       <w:outlineLvl w:val="0"/>
     </w:pPr>
     <w:rPr>
-      <w:rFonts w:asciiTheme="majorHAnsi" w:eastAsiaTheme="majorEastAsia" w:hAnsiTheme="majorHAnsi" w:cstheme="majorBidi"/>
+      <w:rFonts w:asciiTheme="majorHAnsi" w:eastAsiaTheme="majorEastAsia" w:hAnsiTheme="majorHAnsi" w:cstheme="majorBidi" w:ascii="Georgia" w:hAnsi="Georgia" w:eastAsia="Georgia"/>
       <w:b/>
       <w:bCs/>
-      <w:color w:val="365F91" w:themeColor="accent1" w:themeShade="BF"/>
+      <w:color w:val="7D1F3B"/>
       <w:sz w:val="28"/>
       <w:szCs w:val="28"/>
     </w:rPr>
@@ -3026,11 +1344,11 @@
       <w:outlineLvl w:val="1"/>
     </w:pPr>
     <w:rPr>
-      <w:rFonts w:asciiTheme="majorHAnsi" w:eastAsiaTheme="majorEastAsia" w:hAnsiTheme="majorHAnsi" w:cstheme="majorBidi"/>
+      <w:rFonts w:asciiTheme="majorHAnsi" w:eastAsiaTheme="majorEastAsia" w:hAnsiTheme="majorHAnsi" w:cstheme="majorBidi" w:ascii="Georgia" w:hAnsi="Georgia" w:eastAsia="Georgia"/>
       <w:b/>
       <w:bCs/>
-      <w:color w:val="4F81BD" w:themeColor="accent1"/>
-      <w:sz w:val="26"/>
+      <w:color w:val="995323"/>
+      <w:sz w:val="23"/>
       <w:szCs w:val="26"/>
     </w:rPr>
   </w:style>
@@ -3291,11 +1609,12 @@
       <w:contextualSpacing/>
     </w:pPr>
     <w:rPr>
-      <w:rFonts w:asciiTheme="majorHAnsi" w:eastAsiaTheme="majorEastAsia" w:hAnsiTheme="majorHAnsi" w:cstheme="majorBidi"/>
-      <w:color w:val="17365D" w:themeColor="text2" w:themeShade="BF"/>
+      <w:rFonts w:asciiTheme="majorHAnsi" w:eastAsiaTheme="majorEastAsia" w:hAnsiTheme="majorHAnsi" w:cstheme="majorBidi" w:ascii="Georgia" w:hAnsi="Georgia" w:eastAsia="Georgia"/>
+      <w:b/>
+      <w:color w:val="5A1129"/>
       <w:spacing w:val="5"/>
       <w:kern w:val="28"/>
-      <w:sz w:val="52"/>
+      <w:sz w:val="40"/>
       <w:szCs w:val="52"/>
     </w:rPr>
   </w:style>

</xml_diff>

<commit_message>
Clean principal questionnaire and standardize naming
</commit_message>
<xml_diff>
--- a/principal-information-template.docx
+++ b/principal-information-template.docx
@@ -8,7 +8,7 @@
         <w:jc w:val="center"/>
       </w:pPr>
       <w:r>
-        <w:t>Principal / Trustee Information Template</w:t>
+        <w:t>Principal / Trustee Confirmation Template</w:t>
       </w:r>
     </w:p>
     <w:p/>
@@ -17,7 +17,7 @@
         <w:spacing w:after="80"/>
       </w:pPr>
       <w:r>
-        <w:t>Use this template to collect facts, approvals, style requests, and fundraising details for the Swami Vedanta Desikan Thirumaligai, Srirangam webpage.</w:t>
+        <w:t>Use this document to confirm the facts, wording, approvals, and media guidance for the Srimad Vedanta Desikan Thirumaligai, Srirangam page.</w:t>
       </w:r>
     </w:p>
     <w:p/>
@@ -26,16 +26,17 @@
         <w:spacing w:after="80"/>
       </w:pPr>
       <w:r>
-        <w:t>Short phrases are fine. Kannada or Tamil notes are also fine. Final website English can be rewritten later without changing the intended meaning.</w:t>
+        <w:t>Short answers are fine. Tamil or Kannada notes are also fine. The final website English can be refined later, but the underlying facts and approvals must be clear.</w:t>
       </w:r>
     </w:p>
     <w:p/>
     <w:p>
       <w:pPr>
         <w:pStyle w:val="Heading1"/>
+        <w:spacing w:before="200" w:after="80"/>
       </w:pPr>
       <w:r>
-        <w:t>Working Public Draft Already Prepared</w:t>
+        <w:t>Purpose Of This Document</w:t>
       </w:r>
     </w:p>
     <w:p>
@@ -44,7 +45,7 @@
         <w:spacing w:after="60"/>
       </w:pPr>
       <w:r>
-        <w:t>A first donor-page draft has been prepared separately for review.</w:t>
+        <w:t>Confirm the correct public identity of the place</w:t>
       </w:r>
     </w:p>
     <w:p>
@@ -53,13 +54,59 @@
         <w:spacing w:after="60"/>
       </w:pPr>
       <w:r>
-        <w:t>The public page currently draws on these already-used source references:</w:t>
+        <w:t>Confirm the historical and religious significance of the Thirumaligai</w:t>
       </w:r>
     </w:p>
     <w:p>
       <w:pPr>
-        <w:pStyle w:val="ListBullet2"/>
-        <w:spacing w:after="40"/>
+        <w:pStyle w:val="ListBullet"/>
+        <w:spacing w:after="60"/>
+      </w:pPr>
+      <w:r>
+        <w:t>Confirm the role and continuing involvement of Parakala Matham</w:t>
+      </w:r>
+    </w:p>
+    <w:p>
+      <w:pPr>
+        <w:pStyle w:val="ListBullet"/>
+        <w:spacing w:after="60"/>
+      </w:pPr>
+      <w:r>
+        <w:t>Confirm what may and may not be said publicly</w:t>
+      </w:r>
+    </w:p>
+    <w:p>
+      <w:pPr>
+        <w:pStyle w:val="ListBullet"/>
+        <w:spacing w:after="60"/>
+      </w:pPr>
+      <w:r>
+        <w:t>Confirm the funding facts, donation details, and donor wording</w:t>
+      </w:r>
+    </w:p>
+    <w:p>
+      <w:pPr>
+        <w:pStyle w:val="ListBullet"/>
+        <w:spacing w:after="60"/>
+      </w:pPr>
+      <w:r>
+        <w:t>Specify what additional high-quality photographs must be provided</w:t>
+      </w:r>
+    </w:p>
+    <w:p/>
+    <w:p>
+      <w:pPr>
+        <w:pStyle w:val="Heading1"/>
+        <w:spacing w:before="200" w:after="80"/>
+      </w:pPr>
+      <w:r>
+        <w:t>Source References Already Used In Drafting</w:t>
+      </w:r>
+    </w:p>
+    <w:p>
+      <w:pPr>
+        <w:pStyle w:val="ListBullet"/>
+        <w:spacing w:after="60"/>
       </w:pPr>
       <w:r>
         <w:t>Official Parakala Matham page:</w:t>
@@ -70,13 +117,13 @@
         <w:spacing w:after="80"/>
       </w:pPr>
       <w:r>
-        <w:t xml:space="preserve">    https://www.parakalamatham.org/about-the-mutt/sri-parakala-mutt-branches-and-affiliate-temples/newer-tamilnadu-mutts/</w:t>
+        <w:t xml:space="preserve">  https://www.parakalamatham.org/about-the-mutt/sri-parakala-mutt-branches-and-affiliate-temples/newer-tamilnadu-mutts/</w:t>
       </w:r>
     </w:p>
     <w:p>
       <w:pPr>
-        <w:pStyle w:val="ListBullet2"/>
-        <w:spacing w:after="40"/>
+        <w:pStyle w:val="ListBullet"/>
+        <w:spacing w:after="60"/>
       </w:pPr>
       <w:r>
         <w:t>Supporting blog reference:</w:t>
@@ -87,25 +134,17 @@
         <w:spacing w:after="80"/>
       </w:pPr>
       <w:r>
-        <w:t xml:space="preserve">    https://aravamudham.blogspot.com/2010/07/swami-desikans-thirumaligai-at-sri.html</w:t>
-      </w:r>
-    </w:p>
-    <w:p>
-      <w:pPr>
-        <w:pStyle w:val="ListBullet"/>
-        <w:spacing w:after="60"/>
-      </w:pPr>
-      <w:r>
-        <w:t>Please use this form to confirm, correct, strengthen, or remove any wording before the page is treated as final.</w:t>
+        <w:t xml:space="preserve">  https://aravamudham.blogspot.com/2010/07/swami-desikans-thirumaligai-at-sri.html</w:t>
       </w:r>
     </w:p>
     <w:p/>
     <w:p>
       <w:pPr>
         <w:pStyle w:val="Heading1"/>
+        <w:spacing w:before="200" w:after="80"/>
       </w:pPr>
       <w:r>
-        <w:t>Items To Resolve Internally Before Final Public Release</w:t>
+        <w:t>Priority Items Requiring Clear Confirmation</w:t>
       </w:r>
     </w:p>
     <w:p>
@@ -114,7 +153,7 @@
         <w:spacing w:after="60"/>
       </w:pPr>
       <w:r>
-        <w:t>Should the page publicly say Swami Desikan lived here for about 42 years:</w:t>
+        <w:t>Correct official public name to use throughout:</w:t>
       </w:r>
     </w:p>
     <w:p>
@@ -123,7 +162,7 @@
         <w:spacing w:after="60"/>
       </w:pPr>
       <w:r>
-        <w:t>Should the page publicly say he attained Paramapadam from here:</w:t>
+        <w:t>Is `Srimad Vedanta Desikan Thirumaligai` approved as the standard English public name:</w:t>
       </w:r>
     </w:p>
     <w:p>
@@ -132,7 +171,7 @@
         <w:spacing w:after="60"/>
       </w:pPr>
       <w:r>
-        <w:t>Should the page mention preserved features such as the stone structure, wooden girders, family pestle, and kUrmAsanam:</w:t>
+        <w:t>Is the place correctly described as a blessed vaasasthanam associated with Srimad Vedanta Desikan:</w:t>
       </w:r>
     </w:p>
     <w:p>
@@ -141,7 +180,7 @@
         <w:spacing w:after="60"/>
       </w:pPr>
       <w:r>
-        <w:t>Should the page publicly use 300+ years old:</w:t>
+        <w:t>Is it approved to say Srimad Vedanta Desikan stayed here for about 42 years:</w:t>
       </w:r>
     </w:p>
     <w:p>
@@ -150,7 +189,7 @@
         <w:spacing w:after="60"/>
       </w:pPr>
       <w:r>
-        <w:t>Should the public cost figure be Rs. 25 lakhs or Rs. 27 lakhs:</w:t>
+        <w:t>Is it approved to say he attained Paramapadam from here:</w:t>
       </w:r>
     </w:p>
     <w:p>
@@ -159,7 +198,7 @@
         <w:spacing w:after="60"/>
       </w:pPr>
       <w:r>
-        <w:t>Should PLM USA support be shown publicly as Rs. 10 lakhs:</w:t>
+        <w:t>Is the current public cost figure Rs. 27 lakhs:</w:t>
       </w:r>
     </w:p>
     <w:p>
@@ -168,16 +207,26 @@
         <w:spacing w:after="60"/>
       </w:pPr>
       <w:r>
-        <w:t>Are bank details / UPI / QR details approved for immediate publication:</w:t>
+        <w:t>Is it approved to say PLM USA has contributed Rs. 10 lakhs:</w:t>
+      </w:r>
+    </w:p>
+    <w:p>
+      <w:pPr>
+        <w:pStyle w:val="ListBullet"/>
+        <w:spacing w:after="60"/>
+      </w:pPr>
+      <w:r>
+        <w:t>Are donation account / UPI / QR details approved for public display:</w:t>
       </w:r>
     </w:p>
     <w:p/>
     <w:p>
       <w:pPr>
         <w:pStyle w:val="Heading1"/>
+        <w:spacing w:before="200" w:after="80"/>
       </w:pPr>
       <w:r>
-        <w:t>1. Official Identity</w:t>
+        <w:t>1. Official Identity Of The Place</w:t>
       </w:r>
     </w:p>
     <w:p>
@@ -186,7 +235,7 @@
         <w:spacing w:after="60"/>
       </w:pPr>
       <w:r>
-        <w:t>Official English name to use on the page:</w:t>
+        <w:t>Official English name:</w:t>
       </w:r>
     </w:p>
     <w:p>
@@ -195,7 +244,7 @@
         <w:spacing w:after="60"/>
       </w:pPr>
       <w:r>
-        <w:t>Official Tamil / Sanskrit / other name to use on the page:</w:t>
+        <w:t>Official Tamil / Sanskrit name:</w:t>
       </w:r>
     </w:p>
     <w:p>
@@ -204,7 +253,7 @@
         <w:spacing w:after="60"/>
       </w:pPr>
       <w:r>
-        <w:t>Alternate names by which devotees know this place:</w:t>
+        <w:t>Other names by which devotees know this place:</w:t>
       </w:r>
     </w:p>
     <w:p>
@@ -213,16 +262,26 @@
         <w:spacing w:after="60"/>
       </w:pPr>
       <w:r>
-        <w:t>Full location / address:</w:t>
+        <w:t>Full address / street details:</w:t>
+      </w:r>
+    </w:p>
+    <w:p>
+      <w:pPr>
+        <w:pStyle w:val="ListBullet"/>
+        <w:spacing w:after="60"/>
+      </w:pPr>
+      <w:r>
+        <w:t>Any exact wording that must appear under the main heading:</w:t>
       </w:r>
     </w:p>
     <w:p/>
     <w:p>
       <w:pPr>
         <w:pStyle w:val="Heading1"/>
+        <w:spacing w:before="200" w:after="80"/>
       </w:pPr>
       <w:r>
-        <w:t>2. Historical Importance</w:t>
+        <w:t>2. Srimad Vedanta Desikan: Religious Importance To Be Stated Correctly</w:t>
       </w:r>
     </w:p>
     <w:p>
@@ -231,7 +290,7 @@
         <w:spacing w:after="60"/>
       </w:pPr>
       <w:r>
-        <w:t>How should the site be described in one paragraph:</w:t>
+        <w:t>In one short paragraph, how should the website describe the importance of Srimad Vedanta Desikan in relation to this Thirumaligai:</w:t>
       </w:r>
     </w:p>
     <w:p>
@@ -240,7 +299,7 @@
         <w:spacing w:after="60"/>
       </w:pPr>
       <w:r>
-        <w:t>Is it correct to say this is Swami Vedanta Desikan's Thirumaligai:</w:t>
+        <w:t>Which exact points are approved for public use:</w:t>
       </w:r>
     </w:p>
     <w:p>
@@ -249,7 +308,7 @@
         <w:spacing w:after="60"/>
       </w:pPr>
       <w:r>
-        <w:t>Is it correct to say this was a blessed vaasasthanam of Swami Desikan:</w:t>
+        <w:t>Blessed vaasasthanam:</w:t>
       </w:r>
     </w:p>
     <w:p>
@@ -258,7 +317,7 @@
         <w:spacing w:after="60"/>
       </w:pPr>
       <w:r>
-        <w:t>Is it correct to say Swami Desikan stayed here for about 42 years:</w:t>
+        <w:t>Long stay / residence:</w:t>
       </w:r>
     </w:p>
     <w:p>
@@ -267,7 +326,7 @@
         <w:spacing w:after="60"/>
       </w:pPr>
       <w:r>
-        <w:t>Is it correct to say he attained Paramapadam from here:</w:t>
+        <w:t>Paramapadam association:</w:t>
       </w:r>
     </w:p>
     <w:p>
@@ -276,7 +335,7 @@
         <w:spacing w:after="60"/>
       </w:pPr>
       <w:r>
-        <w:t>If yes, what is the preferred authoritative wording for the Paramapadam statement:</w:t>
+        <w:t>Preserved traditional objects / structural associations:</w:t>
       </w:r>
     </w:p>
     <w:p>
@@ -285,16 +344,26 @@
         <w:spacing w:after="60"/>
       </w:pPr>
       <w:r>
-        <w:t>Any wording that should NOT be used publicly:</w:t>
+        <w:t>Any traditional wording, quote, or sampradaya expression preferred here:</w:t>
+      </w:r>
+    </w:p>
+    <w:p>
+      <w:pPr>
+        <w:pStyle w:val="ListBullet"/>
+        <w:spacing w:after="60"/>
+      </w:pPr>
+      <w:r>
+        <w:t>Any wording that must not be used:</w:t>
       </w:r>
     </w:p>
     <w:p/>
     <w:p>
       <w:pPr>
         <w:pStyle w:val="Heading1"/>
+        <w:spacing w:before="200" w:after="80"/>
       </w:pPr>
       <w:r>
-        <w:t>3. Importance To Parakala Matham</w:t>
+        <w:t>3. History Of The Thirumaligai</w:t>
       </w:r>
     </w:p>
     <w:p>
@@ -303,7 +372,7 @@
         <w:spacing w:after="60"/>
       </w:pPr>
       <w:r>
-        <w:t>How is this site connected to Parakala Matham:</w:t>
+        <w:t>In one short paragraph, how should the history of this place be described publicly:</w:t>
       </w:r>
     </w:p>
     <w:p>
@@ -312,7 +381,89 @@
         <w:spacing w:after="60"/>
       </w:pPr>
       <w:r>
-        <w:t>How should this connection be described on the website:</w:t>
+        <w:t>Is the 300+ year old wording approved:</w:t>
+      </w:r>
+    </w:p>
+    <w:p>
+      <w:pPr>
+        <w:pStyle w:val="ListBullet"/>
+        <w:spacing w:after="60"/>
+      </w:pPr>
+      <w:r>
+        <w:t>Are there any specific dates / periods / events that should be mentioned:</w:t>
+      </w:r>
+    </w:p>
+    <w:p>
+      <w:pPr>
+        <w:pStyle w:val="ListBullet"/>
+        <w:spacing w:after="60"/>
+      </w:pPr>
+      <w:r>
+        <w:t>Are there any historical claims that should not be used unless separately verified:</w:t>
+      </w:r>
+    </w:p>
+    <w:p/>
+    <w:p>
+      <w:pPr>
+        <w:pStyle w:val="Heading1"/>
+        <w:spacing w:before="200" w:after="80"/>
+      </w:pPr>
+      <w:r>
+        <w:t>4. Confirmed Involvement Of Parakala Matham</w:t>
+      </w:r>
+    </w:p>
+    <w:p>
+      <w:pPr>
+        <w:pStyle w:val="ListBullet"/>
+        <w:spacing w:after="60"/>
+      </w:pPr>
+      <w:r>
+        <w:t>How should the page describe the connection to Parakala Matham:</w:t>
+      </w:r>
+    </w:p>
+    <w:p>
+      <w:pPr>
+        <w:pStyle w:val="ListBullet"/>
+        <w:spacing w:after="60"/>
+      </w:pPr>
+      <w:r>
+        <w:t>What ongoing role does Parakala Matham play here today:</w:t>
+      </w:r>
+    </w:p>
+    <w:p>
+      <w:pPr>
+        <w:pStyle w:val="ListBullet"/>
+        <w:spacing w:after="60"/>
+      </w:pPr>
+      <w:r>
+        <w:t>Are Acharyan visits to be mentioned publicly:</w:t>
+      </w:r>
+    </w:p>
+    <w:p>
+      <w:pPr>
+        <w:pStyle w:val="ListBullet"/>
+        <w:spacing w:after="60"/>
+      </w:pPr>
+      <w:r>
+        <w:t>If yes, what is the preferred wording:</w:t>
+      </w:r>
+    </w:p>
+    <w:p>
+      <w:pPr>
+        <w:pStyle w:val="ListBullet"/>
+        <w:spacing w:after="60"/>
+      </w:pPr>
+      <w:r>
+        <w:t>Are daily Thiruvaradanam and kainkaryams confirmed:</w:t>
+      </w:r>
+    </w:p>
+    <w:p>
+      <w:pPr>
+        <w:pStyle w:val="ListBullet"/>
+        <w:spacing w:after="60"/>
+      </w:pPr>
+      <w:r>
+        <w:t>Are Azhwar-Acharya Thirunakshatrams, thatheeyaradhanam, dwaadasi observances, pathams, and kalakshepams all confirmed for public mention:</w:t>
       </w:r>
     </w:p>
     <w:p>
@@ -328,9 +479,10 @@
     <w:p>
       <w:pPr>
         <w:pStyle w:val="Heading1"/>
+        <w:spacing w:before="200" w:after="80"/>
       </w:pPr>
       <w:r>
-        <w:t>4. Current Religious Activity</w:t>
+        <w:t>5. Present Condition And Renovation Need</w:t>
       </w:r>
     </w:p>
     <w:p>
@@ -339,7 +491,7 @@
         <w:spacing w:after="60"/>
       </w:pPr>
       <w:r>
-        <w:t>What regular worship is conducted here:</w:t>
+        <w:t>What is the present condition of the building in brief:</w:t>
       </w:r>
     </w:p>
     <w:p>
@@ -348,70 +500,7 @@
         <w:spacing w:after="60"/>
       </w:pPr>
       <w:r>
-        <w:t>Are Thiruvaradanam and daily kainkaryams performed:</w:t>
-      </w:r>
-    </w:p>
-    <w:p>
-      <w:pPr>
-        <w:pStyle w:val="ListBullet"/>
-        <w:spacing w:after="60"/>
-      </w:pPr>
-      <w:r>
-        <w:t>What utsavams / Thirunakshatrams are observed here:</w:t>
-      </w:r>
-    </w:p>
-    <w:p>
-      <w:pPr>
-        <w:pStyle w:val="ListBullet"/>
-        <w:spacing w:after="60"/>
-      </w:pPr>
-      <w:r>
-        <w:t>Are Veda / Prabandha pathams or kalakshepams conducted:</w:t>
-      </w:r>
-    </w:p>
-    <w:p>
-      <w:pPr>
-        <w:pStyle w:val="ListBullet"/>
-        <w:spacing w:after="60"/>
-      </w:pPr>
-      <w:r>
-        <w:t>Any other important spiritual activity to mention:</w:t>
-      </w:r>
-    </w:p>
-    <w:p/>
-    <w:p>
-      <w:pPr>
-        <w:pStyle w:val="Heading1"/>
-      </w:pPr>
-      <w:r>
-        <w:t>5. Renovation And Repair Need</w:t>
-      </w:r>
-    </w:p>
-    <w:p>
-      <w:pPr>
-        <w:pStyle w:val="ListBullet"/>
-        <w:spacing w:after="60"/>
-      </w:pPr>
-      <w:r>
-        <w:t>What is the present condition of the structure:</w:t>
-      </w:r>
-    </w:p>
-    <w:p>
-      <w:pPr>
-        <w:pStyle w:val="ListBullet"/>
-        <w:spacing w:after="60"/>
-      </w:pPr>
-      <w:r>
-        <w:t>Is the 300+ year old wording approved for public use:</w:t>
-      </w:r>
-    </w:p>
-    <w:p>
-      <w:pPr>
-        <w:pStyle w:val="ListBullet"/>
-        <w:spacing w:after="60"/>
-      </w:pPr>
-      <w:r>
-        <w:t>What exact problems should be mentioned:</w:t>
+        <w:t>Which exact problems should the page mention:</w:t>
       </w:r>
     </w:p>
     <w:p>
@@ -429,7 +518,7 @@
         <w:spacing w:after="60"/>
       </w:pPr>
       <w:r>
-        <w:t>Wall / plaster damage:</w:t>
+        <w:t>Wall / plaster deterioration:</w:t>
       </w:r>
     </w:p>
     <w:p>
@@ -447,7 +536,7 @@
         <w:spacing w:after="60"/>
       </w:pPr>
       <w:r>
-        <w:t>Terrace / roof damage:</w:t>
+        <w:t>Terrace / roof deterioration:</w:t>
       </w:r>
     </w:p>
     <w:p>
@@ -456,16 +545,35 @@
         <w:spacing w:after="60"/>
       </w:pPr>
       <w:r>
-        <w:t>Any structural risk that must be highlighted:</w:t>
+        <w:t>Any structural risk or vulnerability that must be highlighted:</w:t>
+      </w:r>
+    </w:p>
+    <w:p>
+      <w:pPr>
+        <w:pStyle w:val="ListBullet"/>
+        <w:spacing w:after="60"/>
+      </w:pPr>
+      <w:r>
+        <w:t>Is it correct to say the renovation has already begun:</w:t>
+      </w:r>
+    </w:p>
+    <w:p>
+      <w:pPr>
+        <w:pStyle w:val="ListBullet"/>
+        <w:spacing w:after="60"/>
+      </w:pPr>
+      <w:r>
+        <w:t>Is it correct to say Acharyan permission has been granted:</w:t>
       </w:r>
     </w:p>
     <w:p/>
     <w:p>
       <w:pPr>
         <w:pStyle w:val="Heading1"/>
+        <w:spacing w:before="200" w:after="80"/>
       </w:pPr>
       <w:r>
-        <w:t>6. Current Project Scope</w:t>
+        <w:t>6. Renovation Scope And Current Project Status</w:t>
       </w:r>
     </w:p>
     <w:p>
@@ -474,7 +582,7 @@
         <w:spacing w:after="60"/>
       </w:pPr>
       <w:r>
-        <w:t>What renovation / restoration work is planned:</w:t>
+        <w:t>What work is planned:</w:t>
       </w:r>
     </w:p>
     <w:p>
@@ -492,7 +600,7 @@
         <w:spacing w:after="60"/>
       </w:pPr>
       <w:r>
-        <w:t>What do the excavation / foundation-related photos show:</w:t>
+        <w:t>What do the bhoomi pooja pictures show:</w:t>
       </w:r>
     </w:p>
     <w:p>
@@ -501,7 +609,7 @@
         <w:spacing w:after="60"/>
       </w:pPr>
       <w:r>
-        <w:t>Is this restoration, renovation, strengthening, or new supporting construction:</w:t>
+        <w:t>What do the approval / grant request letters establish:</w:t>
       </w:r>
     </w:p>
     <w:p>
@@ -510,16 +618,35 @@
         <w:spacing w:after="60"/>
       </w:pPr>
       <w:r>
-        <w:t>Any work that should not be shown or mentioned publicly:</w:t>
+        <w:t>Are there milestones or stages that should be listed publicly:</w:t>
+      </w:r>
+    </w:p>
+    <w:p>
+      <w:pPr>
+        <w:pStyle w:val="ListBullet"/>
+        <w:spacing w:after="60"/>
+      </w:pPr>
+      <w:r>
+        <w:t>Should the page say that more structural issues may be discovered as work progresses:</w:t>
+      </w:r>
+    </w:p>
+    <w:p>
+      <w:pPr>
+        <w:pStyle w:val="ListBullet"/>
+        <w:spacing w:after="60"/>
+      </w:pPr>
+      <w:r>
+        <w:t>Any part of the work that should not be shown publicly:</w:t>
       </w:r>
     </w:p>
     <w:p/>
     <w:p>
       <w:pPr>
         <w:pStyle w:val="Heading1"/>
+        <w:spacing w:before="200" w:after="80"/>
       </w:pPr>
       <w:r>
-        <w:t>7. Estimated Cost And Fundraising</w:t>
+        <w:t>7. Funding Facts And Public Appeal</w:t>
       </w:r>
     </w:p>
     <w:p>
@@ -528,7 +655,7 @@
         <w:spacing w:after="60"/>
       </w:pPr>
       <w:r>
-        <w:t>Is the current estimate still about Rs. 25 lakhs:</w:t>
+        <w:t>Approved public project estimate:</w:t>
       </w:r>
     </w:p>
     <w:p>
@@ -537,7 +664,7 @@
         <w:spacing w:after="60"/>
       </w:pPr>
       <w:r>
-        <w:t>Or should the public page use Rs. 27 lakhs instead:</w:t>
+        <w:t>Amount already arranged:</w:t>
       </w:r>
     </w:p>
     <w:p>
@@ -546,7 +673,7 @@
         <w:spacing w:after="60"/>
       </w:pPr>
       <w:r>
-        <w:t>How much has already been arranged:</w:t>
+        <w:t>Amount still to be raised:</w:t>
       </w:r>
     </w:p>
     <w:p>
@@ -555,7 +682,7 @@
         <w:spacing w:after="60"/>
       </w:pPr>
       <w:r>
-        <w:t>How much still needs to be raised:</w:t>
+        <w:t>Is PLM USA to be shown as donor no. 1:</w:t>
       </w:r>
     </w:p>
     <w:p>
@@ -564,7 +691,7 @@
         <w:spacing w:after="60"/>
       </w:pPr>
       <w:r>
-        <w:t>Should this amount be shown publicly:</w:t>
+        <w:t>Preferred wording for inviting donations from other shishyas and abhimanis:</w:t>
       </w:r>
     </w:p>
     <w:p>
@@ -573,7 +700,7 @@
         <w:spacing w:after="60"/>
       </w:pPr>
       <w:r>
-        <w:t>Preferred wording for the donor appeal:</w:t>
+        <w:t>Preferred wording for saying even small contributions are valuable:</w:t>
       </w:r>
     </w:p>
     <w:p>
@@ -582,25 +709,17 @@
         <w:spacing w:after="60"/>
       </w:pPr>
       <w:r>
-        <w:t>Is it approved to say PLM USA is contributing Rs. 10 lakhs:</w:t>
-      </w:r>
-    </w:p>
-    <w:p>
-      <w:pPr>
-        <w:pStyle w:val="ListBullet"/>
-        <w:spacing w:after="60"/>
-      </w:pPr>
-      <w:r>
-        <w:t>Preferred wording for listing major and minor contributors:</w:t>
+        <w:t>Should the page invite ongoing preservation support in addition to current renovation support:</w:t>
       </w:r>
     </w:p>
     <w:p/>
     <w:p>
       <w:pPr>
         <w:pStyle w:val="Heading1"/>
+        <w:spacing w:before="200" w:after="80"/>
       </w:pPr>
       <w:r>
-        <w:t>8. Contribution Details</w:t>
+        <w:t>8. Donation Details To Be Published</w:t>
       </w:r>
     </w:p>
     <w:p>
@@ -672,7 +791,7 @@
         <w:spacing w:after="60"/>
       </w:pPr>
       <w:r>
-        <w:t>Contact person for donations:</w:t>
+        <w:t>Donation contact person:</w:t>
       </w:r>
     </w:p>
     <w:p>
@@ -699,25 +818,17 @@
         <w:spacing w:after="60"/>
       </w:pPr>
       <w:r>
-        <w:t>Which contribution details can be shown publicly:</w:t>
-      </w:r>
-    </w:p>
-    <w:p>
-      <w:pPr>
-        <w:pStyle w:val="ListBullet"/>
-        <w:spacing w:after="60"/>
-      </w:pPr>
-      <w:r>
-        <w:t>Should the page encourage immediate / direct contributions on the same page:</w:t>
+        <w:t>Which of the above may be shown publicly:</w:t>
       </w:r>
     </w:p>
     <w:p/>
     <w:p>
       <w:pPr>
         <w:pStyle w:val="Heading1"/>
+        <w:spacing w:before="200" w:after="80"/>
       </w:pPr>
       <w:r>
-        <w:t>9. People To Mention Publicly</w:t>
+        <w:t>9. Photos Required From The Principals</w:t>
       </w:r>
     </w:p>
     <w:p>
@@ -726,7 +837,7 @@
         <w:spacing w:after="60"/>
       </w:pPr>
       <w:r>
-        <w:t>Principal / local manager / trustee names to mention:</w:t>
+        <w:t>We need many more high-quality photographs for the website. Please provide the following clearly:</w:t>
       </w:r>
     </w:p>
     <w:p>
@@ -735,7 +846,7 @@
         <w:spacing w:after="60"/>
       </w:pPr>
       <w:r>
-        <w:t>Designations:</w:t>
+        <w:t>Front exterior of the building:</w:t>
       </w:r>
     </w:p>
     <w:p>
@@ -744,7 +855,7 @@
         <w:spacing w:after="60"/>
       </w:pPr>
       <w:r>
-        <w:t>Any Acharya approval wording to include:</w:t>
+        <w:t>Entrance / facade details:</w:t>
       </w:r>
     </w:p>
     <w:p>
@@ -753,16 +864,80 @@
         <w:spacing w:after="60"/>
       </w:pPr>
       <w:r>
-        <w:t>Names that should not be mentioned publicly:</w:t>
+        <w:t>Interior sanctified spaces:</w:t>
+      </w:r>
+    </w:p>
+    <w:p>
+      <w:pPr>
+        <w:pStyle w:val="ListBullet"/>
+        <w:spacing w:after="60"/>
+      </w:pPr>
+      <w:r>
+        <w:t>Places associated with worship / kainkaryam:</w:t>
+      </w:r>
+    </w:p>
+    <w:p>
+      <w:pPr>
+        <w:pStyle w:val="ListBullet"/>
+        <w:spacing w:after="60"/>
+      </w:pPr>
+      <w:r>
+        <w:t>Acharyan visit photographs:</w:t>
+      </w:r>
+    </w:p>
+    <w:p>
+      <w:pPr>
+        <w:pStyle w:val="ListBullet"/>
+        <w:spacing w:after="60"/>
+      </w:pPr>
+      <w:r>
+        <w:t>Daily worship / utsavam / observance photographs:</w:t>
+      </w:r>
+    </w:p>
+    <w:p>
+      <w:pPr>
+        <w:pStyle w:val="ListBullet"/>
+        <w:spacing w:after="60"/>
+      </w:pPr>
+      <w:r>
+        <w:t>Renovation progress photographs:</w:t>
+      </w:r>
+    </w:p>
+    <w:p>
+      <w:pPr>
+        <w:pStyle w:val="ListBullet"/>
+        <w:spacing w:after="60"/>
+      </w:pPr>
+      <w:r>
+        <w:t>Any historically important structural features:</w:t>
+      </w:r>
+    </w:p>
+    <w:p>
+      <w:pPr>
+        <w:pStyle w:val="ListBullet"/>
+        <w:spacing w:after="60"/>
+      </w:pPr>
+      <w:r>
+        <w:t>Any photos that must not be used:</w:t>
+      </w:r>
+    </w:p>
+    <w:p>
+      <w:pPr>
+        <w:pStyle w:val="ListBullet"/>
+        <w:spacing w:after="60"/>
+      </w:pPr>
+      <w:r>
+        <w:t>Captions or explanations for each photo:</w:t>
       </w:r>
     </w:p>
     <w:p/>
     <w:p>
       <w:pPr>
         <w:pStyle w:val="Heading1"/>
+        <w:spacing w:before="200" w:after="80"/>
       </w:pPr>
       <w:r>
-        <w:t>10. Page Content Changes Requested</w:t>
+        <w:t>10. Public Do's And Don'ts</w:t>
       </w:r>
     </w:p>
     <w:p>
@@ -771,7 +946,89 @@
         <w:spacing w:after="60"/>
       </w:pPr>
       <w:r>
-        <w:t>Please remove this item:</w:t>
+        <w:t>Do mention these facts publicly:</w:t>
+      </w:r>
+    </w:p>
+    <w:p>
+      <w:pPr>
+        <w:pStyle w:val="ListBullet"/>
+        <w:spacing w:after="60"/>
+      </w:pPr>
+      <w:r>
+        <w:t>Do not mention these facts publicly:</w:t>
+      </w:r>
+    </w:p>
+    <w:p>
+      <w:pPr>
+        <w:pStyle w:val="ListBullet"/>
+        <w:spacing w:after="60"/>
+      </w:pPr>
+      <w:r>
+        <w:t>Do use this preferred spelling / naming:</w:t>
+      </w:r>
+    </w:p>
+    <w:p>
+      <w:pPr>
+        <w:pStyle w:val="ListBullet"/>
+        <w:spacing w:after="60"/>
+      </w:pPr>
+      <w:r>
+        <w:t>Do not use these spellings / titles / descriptions:</w:t>
+      </w:r>
+    </w:p>
+    <w:p>
+      <w:pPr>
+        <w:pStyle w:val="ListBullet"/>
+        <w:spacing w:after="60"/>
+      </w:pPr>
+      <w:r>
+        <w:t>Do show these people or institutions publicly:</w:t>
+      </w:r>
+    </w:p>
+    <w:p>
+      <w:pPr>
+        <w:pStyle w:val="ListBullet"/>
+        <w:spacing w:after="60"/>
+      </w:pPr>
+      <w:r>
+        <w:t>Do not show these people, names, numbers, or images publicly:</w:t>
+      </w:r>
+    </w:p>
+    <w:p>
+      <w:pPr>
+        <w:pStyle w:val="ListBullet"/>
+        <w:spacing w:after="60"/>
+      </w:pPr>
+      <w:r>
+        <w:t>Do use these donation instructions:</w:t>
+      </w:r>
+    </w:p>
+    <w:p>
+      <w:pPr>
+        <w:pStyle w:val="ListBullet"/>
+        <w:spacing w:after="60"/>
+      </w:pPr>
+      <w:r>
+        <w:t>Do not publish these payment details:</w:t>
+      </w:r>
+    </w:p>
+    <w:p/>
+    <w:p>
+      <w:pPr>
+        <w:pStyle w:val="Heading1"/>
+        <w:spacing w:before="200" w:after="80"/>
+      </w:pPr>
+      <w:r>
+        <w:t>11. Final Review Notes</w:t>
+      </w:r>
+    </w:p>
+    <w:p>
+      <w:pPr>
+        <w:pStyle w:val="ListBullet"/>
+        <w:spacing w:after="60"/>
+      </w:pPr>
+      <w:r>
+        <w:t>Please remove this current website item:</w:t>
       </w:r>
     </w:p>
     <w:p>
@@ -807,7 +1064,7 @@
         <w:spacing w:after="60"/>
       </w:pPr>
       <w:r>
-        <w:t>Please change the order / structure:</w:t>
+        <w:t>Please change the order of sections:</w:t>
       </w:r>
     </w:p>
     <w:p>
@@ -816,58 +1073,13 @@
         <w:spacing w:after="60"/>
       </w:pPr>
       <w:r>
-        <w:t>Please add any quote / slokam / traditional wording:</w:t>
-      </w:r>
-    </w:p>
-    <w:p/>
-    <w:p>
-      <w:pPr>
-        <w:pStyle w:val="Heading1"/>
-      </w:pPr>
-      <w:r>
-        <w:t>11. Media Guidance</w:t>
-      </w:r>
-    </w:p>
-    <w:p>
-      <w:pPr>
-        <w:pStyle w:val="ListBullet"/>
-        <w:spacing w:after="60"/>
-      </w:pPr>
-      <w:r>
-        <w:t>Which photos must be used:</w:t>
-      </w:r>
-    </w:p>
-    <w:p>
-      <w:pPr>
-        <w:pStyle w:val="ListBullet"/>
-        <w:spacing w:after="60"/>
-      </w:pPr>
-      <w:r>
-        <w:t>Which photos should not be used:</w:t>
-      </w:r>
-    </w:p>
-    <w:p>
-      <w:pPr>
-        <w:pStyle w:val="ListBullet"/>
-        <w:spacing w:after="60"/>
-      </w:pPr>
-      <w:r>
-        <w:t>Captions or explanations for the current photos:</w:t>
-      </w:r>
-    </w:p>
-    <w:p>
-      <w:pPr>
-        <w:pStyle w:val="ListBullet"/>
-        <w:spacing w:after="60"/>
-      </w:pPr>
-      <w:r>
-        <w:t>Any additional photos available:</w:t>
+        <w:t>Any final instruction before the page goes public:</w:t>
       </w:r>
     </w:p>
     <w:sectPr>
       <w:footerReference w:type="default" r:id="rId9"/>
       <w:pgSz w:w="12240" w:h="15840"/>
-      <w:pgMar w:top="936" w:right="1080" w:bottom="936" w:left="1080" w:header="720" w:footer="720" w:gutter="0"/>
+      <w:pgMar w:top="864" w:right="1080" w:bottom="864" w:left="1080" w:header="720" w:footer="720" w:gutter="0"/>
       <w:cols w:space="720"/>
       <w:docGrid w:linePitch="360"/>
     </w:sectPr>
@@ -887,7 +1099,7 @@
         <w:color w:val="6B5848"/>
         <w:sz w:val="18"/>
       </w:rPr>
-      <w:t>Working questionnaire for principal and trustee review</w:t>
+      <w:t>Principal and trustee confirmation document</w:t>
     </w:r>
   </w:p>
 </w:ftr>

</xml_diff>